<commit_message>
Expand technical paper content
</commit_message>
<xml_diff>
--- a/contest-deliverables/智能OnCallAgent-技术论文.docx
+++ b/contest-deliverables/智能OnCallAgent-技术论文.docx
@@ -470,7 +470,7 @@
         <w:rPr>
           <w:rFonts w:ascii="Times New Roman" w:hAnsi="Times New Roman"/>
         </w:rPr>
-        <w:t>智能体模式将内部知识库、日志查询、指标查询、时间工具和视觉理解能力编排为可扩展的工具集合。为满足竞赛展示和工程落地需要，项目补充了公网部署、鉴权、知识库管理页面、引用来源卡片和测试集材料，使评审能够直接验证系统不是静态模板问答，而是能够真实调用模型、检索已投喂资料并输出可追溯答案的智能体应用。测试结果表明，系统在支付订单超时、售后</w:t>
+        <w:t>智能体模式将内部知识库、日志查询、指标查询、时间工具和视觉理解能力编排为可扩展的工具集合。为满足工程落地和公开演示需要，项目补充了公网部署、鉴权、知识库管理页面、引用来源卡片和测试集材料，使使用者能够直接验证系统不是静态模板问答，而是能够真实调用模型、检索已投喂资料并输出可追溯答案的智能体应用。测试结果表明，系统在支付订单超时、售后</w:t>
       </w:r>
       <w:r>
         <w:rPr>
@@ -494,7 +494,7 @@
         <w:rPr>
           <w:rFonts w:ascii="Times New Roman" w:hAnsi="Times New Roman"/>
         </w:rPr>
-        <w:t>检索和比赛</w:t>
+        <w:t>检索和统一</w:t>
       </w:r>
       <w:r>
         <w:rPr>
@@ -506,7 +506,22 @@
         <w:rPr>
           <w:rFonts w:ascii="Times New Roman" w:hAnsi="Times New Roman"/>
         </w:rPr>
-        <w:t>接口均可正常访问。本文最后总结了系统的创新价值与后续优化方向，包括更细粒度的权限控制、自动化评测、流式输出、真实监控平台接入和工单系统联动。</w:t>
+        <w:t>服务均可正常访问。本文最后总结了系统的创新价值与后续优化方向，包括更细粒度的权限控制、自动化评测、流式输出、真实监控平台接入和工单系统联动。</w:t>
+      </w:r>
+    </w:p>
+    <w:p>
+      <w:pPr>
+        <w:ind w:firstLine="482"/>
+        <w:jc w:val="both"/>
+        <w:rPr>
+          <w:rFonts w:hint="eastAsia"/>
+        </w:rPr>
+      </w:pPr>
+      <w:r>
+        <w:rPr>
+          <w:rFonts w:ascii="Times New Roman" w:hAnsi="Times New Roman"/>
+        </w:rPr>
+        <w:t>系统实现过程中重点关注三类工程问题：一是如何把分散资料转化为高质量知识片段，使模型回答时有明确事实来源；二是如何让智能体在调用工具时保持可解释、可控制，避免直接给出缺少依据的结论；三是如何将原型能力部署为稳定服务，使浏览器页面、知识库管理、问答接口和向量数据库形成完整闭环。通过这些设计，作品不仅验证了大模型在客服售后和运维支持中的可用性，也为后续接入真实工单、监控和日志平台提供了清晰扩展路径。</w:t>
       </w:r>
     </w:p>
     <w:p>
@@ -671,7 +686,7 @@
       <w:r>
         <w:fldChar w:fldCharType="separate"/>
       </w:r>
-      <w:hyperlink w:anchor="_Toc232608882" w:history="1">
+      <w:hyperlink w:anchor="_Toc232619441" w:history="1">
         <w:r>
           <w:rPr>
             <w:rStyle w:val="aff9"/>
@@ -708,7 +723,7 @@
             <w:noProof/>
             <w:webHidden/>
           </w:rPr>
-          <w:instrText>PAGEREF _Toc232608882 \h</w:instrText>
+          <w:instrText>PAGEREF _Toc232619441 \h</w:instrText>
         </w:r>
         <w:r>
           <w:rPr>
@@ -763,7 +778,7 @@
           <w:noProof/>
         </w:rPr>
       </w:pPr>
-      <w:hyperlink w:anchor="_Toc232608883" w:history="1">
+      <w:hyperlink w:anchor="_Toc232619442" w:history="1">
         <w:r>
           <w:rPr>
             <w:rStyle w:val="aff9"/>
@@ -800,7 +815,7 @@
             <w:noProof/>
             <w:webHidden/>
           </w:rPr>
-          <w:instrText>PAGEREF _Toc232608883 \h</w:instrText>
+          <w:instrText>PAGEREF _Toc232619442 \h</w:instrText>
         </w:r>
         <w:r>
           <w:rPr>
@@ -855,7 +870,7 @@
           <w:noProof/>
         </w:rPr>
       </w:pPr>
-      <w:hyperlink w:anchor="_Toc232608884" w:history="1">
+      <w:hyperlink w:anchor="_Toc232619443" w:history="1">
         <w:r>
           <w:rPr>
             <w:rStyle w:val="aff9"/>
@@ -892,7 +907,7 @@
             <w:noProof/>
             <w:webHidden/>
           </w:rPr>
-          <w:instrText>PAGEREF _Toc232608884 \h</w:instrText>
+          <w:instrText>PAGEREF _Toc232619443 \h</w:instrText>
         </w:r>
         <w:r>
           <w:rPr>
@@ -947,7 +962,7 @@
           <w:noProof/>
         </w:rPr>
       </w:pPr>
-      <w:hyperlink w:anchor="_Toc232608885" w:history="1">
+      <w:hyperlink w:anchor="_Toc232619444" w:history="1">
         <w:r>
           <w:rPr>
             <w:rStyle w:val="aff9"/>
@@ -984,98 +999,7 @@
             <w:noProof/>
             <w:webHidden/>
           </w:rPr>
-          <w:instrText>PAGEREF _Toc232608885 \h</w:instrText>
-        </w:r>
-        <w:r>
-          <w:rPr>
-            <w:rFonts w:hint="eastAsia"/>
-            <w:noProof/>
-            <w:webHidden/>
-          </w:rPr>
-          <w:instrText xml:space="preserve"> </w:instrText>
-        </w:r>
-        <w:r>
-          <w:rPr>
-            <w:rFonts w:hint="eastAsia"/>
-            <w:noProof/>
-            <w:webHidden/>
-          </w:rPr>
-        </w:r>
-        <w:r>
-          <w:rPr>
-            <w:rFonts w:hint="eastAsia"/>
-            <w:noProof/>
-            <w:webHidden/>
-          </w:rPr>
-          <w:fldChar w:fldCharType="separate"/>
-        </w:r>
-        <w:r>
-          <w:rPr>
-            <w:rFonts w:hint="eastAsia"/>
-            <w:noProof/>
-            <w:webHidden/>
-          </w:rPr>
-          <w:t>1</w:t>
-        </w:r>
-        <w:r>
-          <w:rPr>
-            <w:rFonts w:hint="eastAsia"/>
-            <w:noProof/>
-            <w:webHidden/>
-          </w:rPr>
-          <w:fldChar w:fldCharType="end"/>
-        </w:r>
-      </w:hyperlink>
-    </w:p>
-    <w:p>
-      <w:pPr>
-        <w:pStyle w:val="TOC1"/>
-        <w:tabs>
-          <w:tab w:val="right" w:leader="dot" w:pos="9112"/>
-        </w:tabs>
-        <w:rPr>
-          <w:rFonts w:hint="eastAsia"/>
-          <w:noProof/>
-        </w:rPr>
-      </w:pPr>
-      <w:hyperlink w:anchor="_Toc232608886" w:history="1">
-        <w:r>
-          <w:rPr>
-            <w:rStyle w:val="aff9"/>
-            <w:noProof/>
-          </w:rPr>
-          <w:t>第2章 方案论证与设计</w:t>
-        </w:r>
-        <w:r>
-          <w:rPr>
-            <w:rFonts w:hint="eastAsia"/>
-            <w:noProof/>
-            <w:webHidden/>
-          </w:rPr>
-          <w:tab/>
-        </w:r>
-        <w:r>
-          <w:rPr>
-            <w:rFonts w:hint="eastAsia"/>
-            <w:noProof/>
-            <w:webHidden/>
-          </w:rPr>
-          <w:fldChar w:fldCharType="begin"/>
-        </w:r>
-        <w:r>
-          <w:rPr>
-            <w:rFonts w:hint="eastAsia"/>
-            <w:noProof/>
-            <w:webHidden/>
-          </w:rPr>
-          <w:instrText xml:space="preserve"> </w:instrText>
-        </w:r>
-        <w:r>
-          <w:rPr>
-            <w:noProof/>
-            <w:webHidden/>
-          </w:rPr>
-          <w:instrText>PAGEREF _Toc232608886 \h</w:instrText>
+          <w:instrText>PAGEREF _Toc232619444 \h</w:instrText>
         </w:r>
         <w:r>
           <w:rPr>
@@ -1130,13 +1054,13 @@
           <w:noProof/>
         </w:rPr>
       </w:pPr>
-      <w:hyperlink w:anchor="_Toc232608887" w:history="1">
+      <w:hyperlink w:anchor="_Toc232619445" w:history="1">
         <w:r>
           <w:rPr>
             <w:rStyle w:val="aff9"/>
             <w:noProof/>
           </w:rPr>
-          <w:t>2.1 总体方案</w:t>
+          <w:t>1.4 需求分析</w:t>
         </w:r>
         <w:r>
           <w:rPr>
@@ -1167,7 +1091,7 @@
             <w:noProof/>
             <w:webHidden/>
           </w:rPr>
-          <w:instrText>PAGEREF _Toc232608887 \h</w:instrText>
+          <w:instrText>PAGEREF _Toc232619445 \h</w:instrText>
         </w:r>
         <w:r>
           <w:rPr>
@@ -1199,6 +1123,97 @@
             <w:webHidden/>
           </w:rPr>
           <w:t>2</w:t>
+        </w:r>
+        <w:r>
+          <w:rPr>
+            <w:rFonts w:hint="eastAsia"/>
+            <w:noProof/>
+            <w:webHidden/>
+          </w:rPr>
+          <w:fldChar w:fldCharType="end"/>
+        </w:r>
+      </w:hyperlink>
+    </w:p>
+    <w:p>
+      <w:pPr>
+        <w:pStyle w:val="TOC1"/>
+        <w:tabs>
+          <w:tab w:val="right" w:leader="dot" w:pos="9112"/>
+        </w:tabs>
+        <w:rPr>
+          <w:rFonts w:hint="eastAsia"/>
+          <w:noProof/>
+        </w:rPr>
+      </w:pPr>
+      <w:hyperlink w:anchor="_Toc232619446" w:history="1">
+        <w:r>
+          <w:rPr>
+            <w:rStyle w:val="aff9"/>
+            <w:noProof/>
+          </w:rPr>
+          <w:t>第2章 方案论证与设计</w:t>
+        </w:r>
+        <w:r>
+          <w:rPr>
+            <w:rFonts w:hint="eastAsia"/>
+            <w:noProof/>
+            <w:webHidden/>
+          </w:rPr>
+          <w:tab/>
+        </w:r>
+        <w:r>
+          <w:rPr>
+            <w:rFonts w:hint="eastAsia"/>
+            <w:noProof/>
+            <w:webHidden/>
+          </w:rPr>
+          <w:fldChar w:fldCharType="begin"/>
+        </w:r>
+        <w:r>
+          <w:rPr>
+            <w:rFonts w:hint="eastAsia"/>
+            <w:noProof/>
+            <w:webHidden/>
+          </w:rPr>
+          <w:instrText xml:space="preserve"> </w:instrText>
+        </w:r>
+        <w:r>
+          <w:rPr>
+            <w:noProof/>
+            <w:webHidden/>
+          </w:rPr>
+          <w:instrText>PAGEREF _Toc232619446 \h</w:instrText>
+        </w:r>
+        <w:r>
+          <w:rPr>
+            <w:rFonts w:hint="eastAsia"/>
+            <w:noProof/>
+            <w:webHidden/>
+          </w:rPr>
+          <w:instrText xml:space="preserve"> </w:instrText>
+        </w:r>
+        <w:r>
+          <w:rPr>
+            <w:rFonts w:hint="eastAsia"/>
+            <w:noProof/>
+            <w:webHidden/>
+          </w:rPr>
+        </w:r>
+        <w:r>
+          <w:rPr>
+            <w:rFonts w:hint="eastAsia"/>
+            <w:noProof/>
+            <w:webHidden/>
+          </w:rPr>
+          <w:fldChar w:fldCharType="separate"/>
+        </w:r>
+        <w:r>
+          <w:rPr>
+            <w:rFonts w:hint="eastAsia"/>
+            <w:noProof/>
+            <w:webHidden/>
+          </w:rPr>
+          <w:t>3</w:t>
         </w:r>
         <w:r>
           <w:rPr>
@@ -1222,13 +1237,13 @@
           <w:noProof/>
         </w:rPr>
       </w:pPr>
-      <w:hyperlink w:anchor="_Toc232608888" w:history="1">
+      <w:hyperlink w:anchor="_Toc232619447" w:history="1">
         <w:r>
           <w:rPr>
             <w:rStyle w:val="aff9"/>
             <w:noProof/>
           </w:rPr>
-          <w:t>2.2 技术选型论证</w:t>
+          <w:t>2.1 总体方案</w:t>
         </w:r>
         <w:r>
           <w:rPr>
@@ -1259,7 +1274,7 @@
             <w:noProof/>
             <w:webHidden/>
           </w:rPr>
-          <w:instrText>PAGEREF _Toc232608888 \h</w:instrText>
+          <w:instrText>PAGEREF _Toc232619447 \h</w:instrText>
         </w:r>
         <w:r>
           <w:rPr>
@@ -1314,13 +1329,13 @@
           <w:noProof/>
         </w:rPr>
       </w:pPr>
-      <w:hyperlink w:anchor="_Toc232608889" w:history="1">
+      <w:hyperlink w:anchor="_Toc232619448" w:history="1">
         <w:r>
           <w:rPr>
             <w:rStyle w:val="aff9"/>
             <w:noProof/>
           </w:rPr>
-          <w:t>2.3 云端部署方案</w:t>
+          <w:t>2.2 技术选型论证</w:t>
         </w:r>
         <w:r>
           <w:rPr>
@@ -1351,7 +1366,7 @@
             <w:noProof/>
             <w:webHidden/>
           </w:rPr>
-          <w:instrText>PAGEREF _Toc232608889 \h</w:instrText>
+          <w:instrText>PAGEREF _Toc232619448 \h</w:instrText>
         </w:r>
         <w:r>
           <w:rPr>
@@ -1382,98 +1397,7 @@
             <w:noProof/>
             <w:webHidden/>
           </w:rPr>
-          <w:t>4</w:t>
-        </w:r>
-        <w:r>
-          <w:rPr>
-            <w:rFonts w:hint="eastAsia"/>
-            <w:noProof/>
-            <w:webHidden/>
-          </w:rPr>
-          <w:fldChar w:fldCharType="end"/>
-        </w:r>
-      </w:hyperlink>
-    </w:p>
-    <w:p>
-      <w:pPr>
-        <w:pStyle w:val="TOC1"/>
-        <w:tabs>
-          <w:tab w:val="right" w:leader="dot" w:pos="9112"/>
-        </w:tabs>
-        <w:rPr>
-          <w:rFonts w:hint="eastAsia"/>
-          <w:noProof/>
-        </w:rPr>
-      </w:pPr>
-      <w:hyperlink w:anchor="_Toc232608890" w:history="1">
-        <w:r>
-          <w:rPr>
-            <w:rStyle w:val="aff9"/>
-            <w:noProof/>
-          </w:rPr>
-          <w:t>第3章 原理分析与系统架构</w:t>
-        </w:r>
-        <w:r>
-          <w:rPr>
-            <w:rFonts w:hint="eastAsia"/>
-            <w:noProof/>
-            <w:webHidden/>
-          </w:rPr>
-          <w:tab/>
-        </w:r>
-        <w:r>
-          <w:rPr>
-            <w:rFonts w:hint="eastAsia"/>
-            <w:noProof/>
-            <w:webHidden/>
-          </w:rPr>
-          <w:fldChar w:fldCharType="begin"/>
-        </w:r>
-        <w:r>
-          <w:rPr>
-            <w:rFonts w:hint="eastAsia"/>
-            <w:noProof/>
-            <w:webHidden/>
-          </w:rPr>
-          <w:instrText xml:space="preserve"> </w:instrText>
-        </w:r>
-        <w:r>
-          <w:rPr>
-            <w:noProof/>
-            <w:webHidden/>
-          </w:rPr>
-          <w:instrText>PAGEREF _Toc232608890 \h</w:instrText>
-        </w:r>
-        <w:r>
-          <w:rPr>
-            <w:rFonts w:hint="eastAsia"/>
-            <w:noProof/>
-            <w:webHidden/>
-          </w:rPr>
-          <w:instrText xml:space="preserve"> </w:instrText>
-        </w:r>
-        <w:r>
-          <w:rPr>
-            <w:rFonts w:hint="eastAsia"/>
-            <w:noProof/>
-            <w:webHidden/>
-          </w:rPr>
-        </w:r>
-        <w:r>
-          <w:rPr>
-            <w:rFonts w:hint="eastAsia"/>
-            <w:noProof/>
-            <w:webHidden/>
-          </w:rPr>
-          <w:fldChar w:fldCharType="separate"/>
-        </w:r>
-        <w:r>
-          <w:rPr>
-            <w:rFonts w:hint="eastAsia"/>
-            <w:noProof/>
-            <w:webHidden/>
-          </w:rPr>
-          <w:t>4</w:t>
+          <w:t>5</w:t>
         </w:r>
         <w:r>
           <w:rPr>
@@ -1497,13 +1421,13 @@
           <w:noProof/>
         </w:rPr>
       </w:pPr>
-      <w:hyperlink w:anchor="_Toc232608891" w:history="1">
+      <w:hyperlink w:anchor="_Toc232619449" w:history="1">
         <w:r>
           <w:rPr>
             <w:rStyle w:val="aff9"/>
             <w:noProof/>
           </w:rPr>
-          <w:t>3.1 RAG 检索增强生成原理</w:t>
+          <w:t>2.3 云端部署方案</w:t>
         </w:r>
         <w:r>
           <w:rPr>
@@ -1534,7 +1458,7 @@
             <w:noProof/>
             <w:webHidden/>
           </w:rPr>
-          <w:instrText>PAGEREF _Toc232608891 \h</w:instrText>
+          <w:instrText>PAGEREF _Toc232619449 \h</w:instrText>
         </w:r>
         <w:r>
           <w:rPr>
@@ -1565,7 +1489,7 @@
             <w:noProof/>
             <w:webHidden/>
           </w:rPr>
-          <w:t>4</w:t>
+          <w:t>6</w:t>
         </w:r>
         <w:r>
           <w:rPr>
@@ -1589,13 +1513,13 @@
           <w:noProof/>
         </w:rPr>
       </w:pPr>
-      <w:hyperlink w:anchor="_Toc232608892" w:history="1">
+      <w:hyperlink w:anchor="_Toc232619450" w:history="1">
         <w:r>
           <w:rPr>
             <w:rStyle w:val="aff9"/>
             <w:noProof/>
           </w:rPr>
-          <w:t>3.2 ReAct 智能体原理</w:t>
+          <w:t>2.4 设计原则</w:t>
         </w:r>
         <w:r>
           <w:rPr>
@@ -1626,7 +1550,7 @@
             <w:noProof/>
             <w:webHidden/>
           </w:rPr>
-          <w:instrText>PAGEREF _Toc232608892 \h</w:instrText>
+          <w:instrText>PAGEREF _Toc232619450 \h</w:instrText>
         </w:r>
         <w:r>
           <w:rPr>
@@ -1657,7 +1581,98 @@
             <w:noProof/>
             <w:webHidden/>
           </w:rPr>
-          <w:t>5</w:t>
+          <w:t>6</w:t>
+        </w:r>
+        <w:r>
+          <w:rPr>
+            <w:rFonts w:hint="eastAsia"/>
+            <w:noProof/>
+            <w:webHidden/>
+          </w:rPr>
+          <w:fldChar w:fldCharType="end"/>
+        </w:r>
+      </w:hyperlink>
+    </w:p>
+    <w:p>
+      <w:pPr>
+        <w:pStyle w:val="TOC1"/>
+        <w:tabs>
+          <w:tab w:val="right" w:leader="dot" w:pos="9112"/>
+        </w:tabs>
+        <w:rPr>
+          <w:rFonts w:hint="eastAsia"/>
+          <w:noProof/>
+        </w:rPr>
+      </w:pPr>
+      <w:hyperlink w:anchor="_Toc232619451" w:history="1">
+        <w:r>
+          <w:rPr>
+            <w:rStyle w:val="aff9"/>
+            <w:noProof/>
+          </w:rPr>
+          <w:t>第3章 原理分析与系统架构</w:t>
+        </w:r>
+        <w:r>
+          <w:rPr>
+            <w:rFonts w:hint="eastAsia"/>
+            <w:noProof/>
+            <w:webHidden/>
+          </w:rPr>
+          <w:tab/>
+        </w:r>
+        <w:r>
+          <w:rPr>
+            <w:rFonts w:hint="eastAsia"/>
+            <w:noProof/>
+            <w:webHidden/>
+          </w:rPr>
+          <w:fldChar w:fldCharType="begin"/>
+        </w:r>
+        <w:r>
+          <w:rPr>
+            <w:rFonts w:hint="eastAsia"/>
+            <w:noProof/>
+            <w:webHidden/>
+          </w:rPr>
+          <w:instrText xml:space="preserve"> </w:instrText>
+        </w:r>
+        <w:r>
+          <w:rPr>
+            <w:noProof/>
+            <w:webHidden/>
+          </w:rPr>
+          <w:instrText>PAGEREF _Toc232619451 \h</w:instrText>
+        </w:r>
+        <w:r>
+          <w:rPr>
+            <w:rFonts w:hint="eastAsia"/>
+            <w:noProof/>
+            <w:webHidden/>
+          </w:rPr>
+          <w:instrText xml:space="preserve"> </w:instrText>
+        </w:r>
+        <w:r>
+          <w:rPr>
+            <w:rFonts w:hint="eastAsia"/>
+            <w:noProof/>
+            <w:webHidden/>
+          </w:rPr>
+        </w:r>
+        <w:r>
+          <w:rPr>
+            <w:rFonts w:hint="eastAsia"/>
+            <w:noProof/>
+            <w:webHidden/>
+          </w:rPr>
+          <w:fldChar w:fldCharType="separate"/>
+        </w:r>
+        <w:r>
+          <w:rPr>
+            <w:rFonts w:hint="eastAsia"/>
+            <w:noProof/>
+            <w:webHidden/>
+          </w:rPr>
+          <w:t>7</w:t>
         </w:r>
         <w:r>
           <w:rPr>
@@ -1681,13 +1696,13 @@
           <w:noProof/>
         </w:rPr>
       </w:pPr>
-      <w:hyperlink w:anchor="_Toc232608893" w:history="1">
+      <w:hyperlink w:anchor="_Toc232619452" w:history="1">
         <w:r>
           <w:rPr>
             <w:rStyle w:val="aff9"/>
             <w:noProof/>
           </w:rPr>
-          <w:t>3.3 多模态与硬件说明</w:t>
+          <w:t>3.1 RAG 检索增强生成原理</w:t>
         </w:r>
         <w:r>
           <w:rPr>
@@ -1718,7 +1733,7 @@
             <w:noProof/>
             <w:webHidden/>
           </w:rPr>
-          <w:instrText>PAGEREF _Toc232608893 \h</w:instrText>
+          <w:instrText>PAGEREF _Toc232619452 \h</w:instrText>
         </w:r>
         <w:r>
           <w:rPr>
@@ -1749,98 +1764,7 @@
             <w:noProof/>
             <w:webHidden/>
           </w:rPr>
-          <w:t>6</w:t>
-        </w:r>
-        <w:r>
-          <w:rPr>
-            <w:rFonts w:hint="eastAsia"/>
-            <w:noProof/>
-            <w:webHidden/>
-          </w:rPr>
-          <w:fldChar w:fldCharType="end"/>
-        </w:r>
-      </w:hyperlink>
-    </w:p>
-    <w:p>
-      <w:pPr>
-        <w:pStyle w:val="TOC1"/>
-        <w:tabs>
-          <w:tab w:val="right" w:leader="dot" w:pos="9112"/>
-        </w:tabs>
-        <w:rPr>
-          <w:rFonts w:hint="eastAsia"/>
-          <w:noProof/>
-        </w:rPr>
-      </w:pPr>
-      <w:hyperlink w:anchor="_Toc232608894" w:history="1">
-        <w:r>
-          <w:rPr>
-            <w:rStyle w:val="aff9"/>
-            <w:noProof/>
-          </w:rPr>
-          <w:t>第4章 软件设计与流程</w:t>
-        </w:r>
-        <w:r>
-          <w:rPr>
-            <w:rFonts w:hint="eastAsia"/>
-            <w:noProof/>
-            <w:webHidden/>
-          </w:rPr>
-          <w:tab/>
-        </w:r>
-        <w:r>
-          <w:rPr>
-            <w:rFonts w:hint="eastAsia"/>
-            <w:noProof/>
-            <w:webHidden/>
-          </w:rPr>
-          <w:fldChar w:fldCharType="begin"/>
-        </w:r>
-        <w:r>
-          <w:rPr>
-            <w:rFonts w:hint="eastAsia"/>
-            <w:noProof/>
-            <w:webHidden/>
-          </w:rPr>
-          <w:instrText xml:space="preserve"> </w:instrText>
-        </w:r>
-        <w:r>
-          <w:rPr>
-            <w:noProof/>
-            <w:webHidden/>
-          </w:rPr>
-          <w:instrText>PAGEREF _Toc232608894 \h</w:instrText>
-        </w:r>
-        <w:r>
-          <w:rPr>
-            <w:rFonts w:hint="eastAsia"/>
-            <w:noProof/>
-            <w:webHidden/>
-          </w:rPr>
-          <w:instrText xml:space="preserve"> </w:instrText>
-        </w:r>
-        <w:r>
-          <w:rPr>
-            <w:rFonts w:hint="eastAsia"/>
-            <w:noProof/>
-            <w:webHidden/>
-          </w:rPr>
-        </w:r>
-        <w:r>
-          <w:rPr>
-            <w:rFonts w:hint="eastAsia"/>
-            <w:noProof/>
-            <w:webHidden/>
-          </w:rPr>
-          <w:fldChar w:fldCharType="separate"/>
-        </w:r>
-        <w:r>
-          <w:rPr>
-            <w:rFonts w:hint="eastAsia"/>
-            <w:noProof/>
-            <w:webHidden/>
-          </w:rPr>
-          <w:t>6</w:t>
+          <w:t>7</w:t>
         </w:r>
         <w:r>
           <w:rPr>
@@ -1864,13 +1788,13 @@
           <w:noProof/>
         </w:rPr>
       </w:pPr>
-      <w:hyperlink w:anchor="_Toc232608895" w:history="1">
+      <w:hyperlink w:anchor="_Toc232619453" w:history="1">
         <w:r>
           <w:rPr>
             <w:rStyle w:val="aff9"/>
             <w:noProof/>
           </w:rPr>
-          <w:t>4.1 后端接口设计</w:t>
+          <w:t>3.2 ReAct 智能体原理</w:t>
         </w:r>
         <w:r>
           <w:rPr>
@@ -1901,7 +1825,7 @@
             <w:noProof/>
             <w:webHidden/>
           </w:rPr>
-          <w:instrText>PAGEREF _Toc232608895 \h</w:instrText>
+          <w:instrText>PAGEREF _Toc232619453 \h</w:instrText>
         </w:r>
         <w:r>
           <w:rPr>
@@ -1932,7 +1856,7 @@
             <w:noProof/>
             <w:webHidden/>
           </w:rPr>
-          <w:t>6</w:t>
+          <w:t>8</w:t>
         </w:r>
         <w:r>
           <w:rPr>
@@ -1956,13 +1880,13 @@
           <w:noProof/>
         </w:rPr>
       </w:pPr>
-      <w:hyperlink w:anchor="_Toc232608896" w:history="1">
+      <w:hyperlink w:anchor="_Toc232619454" w:history="1">
         <w:r>
           <w:rPr>
             <w:rStyle w:val="aff9"/>
             <w:noProof/>
           </w:rPr>
-          <w:t>4.2 知识库投喂流程</w:t>
+          <w:t>3.3 Prompt 组织与上下文控制</w:t>
         </w:r>
         <w:r>
           <w:rPr>
@@ -1993,7 +1917,7 @@
             <w:noProof/>
             <w:webHidden/>
           </w:rPr>
-          <w:instrText>PAGEREF _Toc232608896 \h</w:instrText>
+          <w:instrText>PAGEREF _Toc232619454 \h</w:instrText>
         </w:r>
         <w:r>
           <w:rPr>
@@ -2024,7 +1948,7 @@
             <w:noProof/>
             <w:webHidden/>
           </w:rPr>
-          <w:t>7</w:t>
+          <w:t>9</w:t>
         </w:r>
         <w:r>
           <w:rPr>
@@ -2048,13 +1972,13 @@
           <w:noProof/>
         </w:rPr>
       </w:pPr>
-      <w:hyperlink w:anchor="_Toc232608897" w:history="1">
+      <w:hyperlink w:anchor="_Toc232619455" w:history="1">
         <w:r>
           <w:rPr>
             <w:rStyle w:val="aff9"/>
             <w:noProof/>
           </w:rPr>
-          <w:t>4.3 前端交互设计</w:t>
+          <w:t>3.4 多模态与硬件说明</w:t>
         </w:r>
         <w:r>
           <w:rPr>
@@ -2085,7 +2009,7 @@
             <w:noProof/>
             <w:webHidden/>
           </w:rPr>
-          <w:instrText>PAGEREF _Toc232608897 \h</w:instrText>
+          <w:instrText>PAGEREF _Toc232619455 \h</w:instrText>
         </w:r>
         <w:r>
           <w:rPr>
@@ -2116,7 +2040,98 @@
             <w:noProof/>
             <w:webHidden/>
           </w:rPr>
-          <w:t>7</w:t>
+          <w:t>10</w:t>
+        </w:r>
+        <w:r>
+          <w:rPr>
+            <w:rFonts w:hint="eastAsia"/>
+            <w:noProof/>
+            <w:webHidden/>
+          </w:rPr>
+          <w:fldChar w:fldCharType="end"/>
+        </w:r>
+      </w:hyperlink>
+    </w:p>
+    <w:p>
+      <w:pPr>
+        <w:pStyle w:val="TOC1"/>
+        <w:tabs>
+          <w:tab w:val="right" w:leader="dot" w:pos="9112"/>
+        </w:tabs>
+        <w:rPr>
+          <w:rFonts w:hint="eastAsia"/>
+          <w:noProof/>
+        </w:rPr>
+      </w:pPr>
+      <w:hyperlink w:anchor="_Toc232619456" w:history="1">
+        <w:r>
+          <w:rPr>
+            <w:rStyle w:val="aff9"/>
+            <w:noProof/>
+          </w:rPr>
+          <w:t>第4章 软件设计与流程</w:t>
+        </w:r>
+        <w:r>
+          <w:rPr>
+            <w:rFonts w:hint="eastAsia"/>
+            <w:noProof/>
+            <w:webHidden/>
+          </w:rPr>
+          <w:tab/>
+        </w:r>
+        <w:r>
+          <w:rPr>
+            <w:rFonts w:hint="eastAsia"/>
+            <w:noProof/>
+            <w:webHidden/>
+          </w:rPr>
+          <w:fldChar w:fldCharType="begin"/>
+        </w:r>
+        <w:r>
+          <w:rPr>
+            <w:rFonts w:hint="eastAsia"/>
+            <w:noProof/>
+            <w:webHidden/>
+          </w:rPr>
+          <w:instrText xml:space="preserve"> </w:instrText>
+        </w:r>
+        <w:r>
+          <w:rPr>
+            <w:noProof/>
+            <w:webHidden/>
+          </w:rPr>
+          <w:instrText>PAGEREF _Toc232619456 \h</w:instrText>
+        </w:r>
+        <w:r>
+          <w:rPr>
+            <w:rFonts w:hint="eastAsia"/>
+            <w:noProof/>
+            <w:webHidden/>
+          </w:rPr>
+          <w:instrText xml:space="preserve"> </w:instrText>
+        </w:r>
+        <w:r>
+          <w:rPr>
+            <w:rFonts w:hint="eastAsia"/>
+            <w:noProof/>
+            <w:webHidden/>
+          </w:rPr>
+        </w:r>
+        <w:r>
+          <w:rPr>
+            <w:rFonts w:hint="eastAsia"/>
+            <w:noProof/>
+            <w:webHidden/>
+          </w:rPr>
+          <w:fldChar w:fldCharType="separate"/>
+        </w:r>
+        <w:r>
+          <w:rPr>
+            <w:rFonts w:hint="eastAsia"/>
+            <w:noProof/>
+            <w:webHidden/>
+          </w:rPr>
+          <w:t>10</w:t>
         </w:r>
         <w:r>
           <w:rPr>
@@ -2140,13 +2155,13 @@
           <w:noProof/>
         </w:rPr>
       </w:pPr>
-      <w:hyperlink w:anchor="_Toc232608898" w:history="1">
+      <w:hyperlink w:anchor="_Toc232619457" w:history="1">
         <w:r>
           <w:rPr>
             <w:rStyle w:val="aff9"/>
             <w:noProof/>
           </w:rPr>
-          <w:t>4.4 安全与配置设计</w:t>
+          <w:t>4.1 后端接口设计</w:t>
         </w:r>
         <w:r>
           <w:rPr>
@@ -2177,7 +2192,7 @@
             <w:noProof/>
             <w:webHidden/>
           </w:rPr>
-          <w:instrText>PAGEREF _Toc232608898 \h</w:instrText>
+          <w:instrText>PAGEREF _Toc232619457 \h</w:instrText>
         </w:r>
         <w:r>
           <w:rPr>
@@ -2208,98 +2223,7 @@
             <w:noProof/>
             <w:webHidden/>
           </w:rPr>
-          <w:t>9</w:t>
-        </w:r>
-        <w:r>
-          <w:rPr>
-            <w:rFonts w:hint="eastAsia"/>
-            <w:noProof/>
-            <w:webHidden/>
-          </w:rPr>
-          <w:fldChar w:fldCharType="end"/>
-        </w:r>
-      </w:hyperlink>
-    </w:p>
-    <w:p>
-      <w:pPr>
-        <w:pStyle w:val="TOC1"/>
-        <w:tabs>
-          <w:tab w:val="right" w:leader="dot" w:pos="9112"/>
-        </w:tabs>
-        <w:rPr>
-          <w:rFonts w:hint="eastAsia"/>
-          <w:noProof/>
-        </w:rPr>
-      </w:pPr>
-      <w:hyperlink w:anchor="_Toc232608899" w:history="1">
-        <w:r>
-          <w:rPr>
-            <w:rStyle w:val="aff9"/>
-            <w:noProof/>
-          </w:rPr>
-          <w:t>第5章 系统测试与分析</w:t>
-        </w:r>
-        <w:r>
-          <w:rPr>
-            <w:rFonts w:hint="eastAsia"/>
-            <w:noProof/>
-            <w:webHidden/>
-          </w:rPr>
-          <w:tab/>
-        </w:r>
-        <w:r>
-          <w:rPr>
-            <w:rFonts w:hint="eastAsia"/>
-            <w:noProof/>
-            <w:webHidden/>
-          </w:rPr>
-          <w:fldChar w:fldCharType="begin"/>
-        </w:r>
-        <w:r>
-          <w:rPr>
-            <w:rFonts w:hint="eastAsia"/>
-            <w:noProof/>
-            <w:webHidden/>
-          </w:rPr>
-          <w:instrText xml:space="preserve"> </w:instrText>
-        </w:r>
-        <w:r>
-          <w:rPr>
-            <w:noProof/>
-            <w:webHidden/>
-          </w:rPr>
-          <w:instrText>PAGEREF _Toc232608899 \h</w:instrText>
-        </w:r>
-        <w:r>
-          <w:rPr>
-            <w:rFonts w:hint="eastAsia"/>
-            <w:noProof/>
-            <w:webHidden/>
-          </w:rPr>
-          <w:instrText xml:space="preserve"> </w:instrText>
-        </w:r>
-        <w:r>
-          <w:rPr>
-            <w:rFonts w:hint="eastAsia"/>
-            <w:noProof/>
-            <w:webHidden/>
-          </w:rPr>
-        </w:r>
-        <w:r>
-          <w:rPr>
-            <w:rFonts w:hint="eastAsia"/>
-            <w:noProof/>
-            <w:webHidden/>
-          </w:rPr>
-          <w:fldChar w:fldCharType="separate"/>
-        </w:r>
-        <w:r>
-          <w:rPr>
-            <w:rFonts w:hint="eastAsia"/>
-            <w:noProof/>
-            <w:webHidden/>
-          </w:rPr>
-          <w:t>9</w:t>
+          <w:t>10</w:t>
         </w:r>
         <w:r>
           <w:rPr>
@@ -2323,13 +2247,13 @@
           <w:noProof/>
         </w:rPr>
       </w:pPr>
-      <w:hyperlink w:anchor="_Toc232608900" w:history="1">
+      <w:hyperlink w:anchor="_Toc232619458" w:history="1">
         <w:r>
           <w:rPr>
             <w:rStyle w:val="aff9"/>
             <w:noProof/>
           </w:rPr>
-          <w:t>5.1 测试环境</w:t>
+          <w:t>4.2 知识库投喂流程</w:t>
         </w:r>
         <w:r>
           <w:rPr>
@@ -2360,7 +2284,7 @@
             <w:noProof/>
             <w:webHidden/>
           </w:rPr>
-          <w:instrText>PAGEREF _Toc232608900 \h</w:instrText>
+          <w:instrText>PAGEREF _Toc232619458 \h</w:instrText>
         </w:r>
         <w:r>
           <w:rPr>
@@ -2391,7 +2315,7 @@
             <w:noProof/>
             <w:webHidden/>
           </w:rPr>
-          <w:t>9</w:t>
+          <w:t>11</w:t>
         </w:r>
         <w:r>
           <w:rPr>
@@ -2415,13 +2339,13 @@
           <w:noProof/>
         </w:rPr>
       </w:pPr>
-      <w:hyperlink w:anchor="_Toc232608901" w:history="1">
+      <w:hyperlink w:anchor="_Toc232619459" w:history="1">
         <w:r>
           <w:rPr>
             <w:rStyle w:val="aff9"/>
             <w:noProof/>
           </w:rPr>
-          <w:t>5.2 功能测试结果</w:t>
+          <w:t>4.3 前端交互设计</w:t>
         </w:r>
         <w:r>
           <w:rPr>
@@ -2452,7 +2376,7 @@
             <w:noProof/>
             <w:webHidden/>
           </w:rPr>
-          <w:instrText>PAGEREF _Toc232608901 \h</w:instrText>
+          <w:instrText>PAGEREF _Toc232619459 \h</w:instrText>
         </w:r>
         <w:r>
           <w:rPr>
@@ -2483,7 +2407,7 @@
             <w:noProof/>
             <w:webHidden/>
           </w:rPr>
-          <w:t>9</w:t>
+          <w:t>11</w:t>
         </w:r>
         <w:r>
           <w:rPr>
@@ -2507,13 +2431,13 @@
           <w:noProof/>
         </w:rPr>
       </w:pPr>
-      <w:hyperlink w:anchor="_Toc232608902" w:history="1">
+      <w:hyperlink w:anchor="_Toc232619460" w:history="1">
         <w:r>
           <w:rPr>
             <w:rStyle w:val="aff9"/>
             <w:noProof/>
           </w:rPr>
-          <w:t>5.3 典型问答验证</w:t>
+          <w:t>4.4 安全与配置设计</w:t>
         </w:r>
         <w:r>
           <w:rPr>
@@ -2544,7 +2468,7 @@
             <w:noProof/>
             <w:webHidden/>
           </w:rPr>
-          <w:instrText>PAGEREF _Toc232608902 \h</w:instrText>
+          <w:instrText>PAGEREF _Toc232619460 \h</w:instrText>
         </w:r>
         <w:r>
           <w:rPr>
@@ -2575,7 +2499,7 @@
             <w:noProof/>
             <w:webHidden/>
           </w:rPr>
-          <w:t>10</w:t>
+          <w:t>13</w:t>
         </w:r>
         <w:r>
           <w:rPr>
@@ -2599,13 +2523,13 @@
           <w:noProof/>
         </w:rPr>
       </w:pPr>
-      <w:hyperlink w:anchor="_Toc232608903" w:history="1">
+      <w:hyperlink w:anchor="_Toc232619461" w:history="1">
         <w:r>
           <w:rPr>
             <w:rStyle w:val="aff9"/>
             <w:noProof/>
           </w:rPr>
-          <w:t>5.4 测试分析</w:t>
+          <w:t>4.5 异常处理与可维护性设计</w:t>
         </w:r>
         <w:r>
           <w:rPr>
@@ -2636,7 +2560,7 @@
             <w:noProof/>
             <w:webHidden/>
           </w:rPr>
-          <w:instrText>PAGEREF _Toc232608903 \h</w:instrText>
+          <w:instrText>PAGEREF _Toc232619461 \h</w:instrText>
         </w:r>
         <w:r>
           <w:rPr>
@@ -2667,7 +2591,7 @@
             <w:noProof/>
             <w:webHidden/>
           </w:rPr>
-          <w:t>11</w:t>
+          <w:t>13</w:t>
         </w:r>
         <w:r>
           <w:rPr>
@@ -2690,13 +2614,13 @@
           <w:noProof/>
         </w:rPr>
       </w:pPr>
-      <w:hyperlink w:anchor="_Toc232608904" w:history="1">
+      <w:hyperlink w:anchor="_Toc232619462" w:history="1">
         <w:r>
           <w:rPr>
             <w:rStyle w:val="aff9"/>
             <w:noProof/>
           </w:rPr>
-          <w:t>第6章 总结</w:t>
+          <w:t>第5章 系统测试与分析</w:t>
         </w:r>
         <w:r>
           <w:rPr>
@@ -2727,7 +2651,7 @@
             <w:noProof/>
             <w:webHidden/>
           </w:rPr>
-          <w:instrText>PAGEREF _Toc232608904 \h</w:instrText>
+          <w:instrText>PAGEREF _Toc232619462 \h</w:instrText>
         </w:r>
         <w:r>
           <w:rPr>
@@ -2758,7 +2682,467 @@
             <w:noProof/>
             <w:webHidden/>
           </w:rPr>
-          <w:t>11</w:t>
+          <w:t>13</w:t>
+        </w:r>
+        <w:r>
+          <w:rPr>
+            <w:rFonts w:hint="eastAsia"/>
+            <w:noProof/>
+            <w:webHidden/>
+          </w:rPr>
+          <w:fldChar w:fldCharType="end"/>
+        </w:r>
+      </w:hyperlink>
+    </w:p>
+    <w:p>
+      <w:pPr>
+        <w:pStyle w:val="TOC2"/>
+        <w:tabs>
+          <w:tab w:val="right" w:leader="dot" w:pos="9112"/>
+        </w:tabs>
+        <w:ind w:left="480"/>
+        <w:rPr>
+          <w:rFonts w:hint="eastAsia"/>
+          <w:noProof/>
+        </w:rPr>
+      </w:pPr>
+      <w:hyperlink w:anchor="_Toc232619463" w:history="1">
+        <w:r>
+          <w:rPr>
+            <w:rStyle w:val="aff9"/>
+            <w:noProof/>
+          </w:rPr>
+          <w:t>5.1 测试环境</w:t>
+        </w:r>
+        <w:r>
+          <w:rPr>
+            <w:rFonts w:hint="eastAsia"/>
+            <w:noProof/>
+            <w:webHidden/>
+          </w:rPr>
+          <w:tab/>
+        </w:r>
+        <w:r>
+          <w:rPr>
+            <w:rFonts w:hint="eastAsia"/>
+            <w:noProof/>
+            <w:webHidden/>
+          </w:rPr>
+          <w:fldChar w:fldCharType="begin"/>
+        </w:r>
+        <w:r>
+          <w:rPr>
+            <w:rFonts w:hint="eastAsia"/>
+            <w:noProof/>
+            <w:webHidden/>
+          </w:rPr>
+          <w:instrText xml:space="preserve"> </w:instrText>
+        </w:r>
+        <w:r>
+          <w:rPr>
+            <w:noProof/>
+            <w:webHidden/>
+          </w:rPr>
+          <w:instrText>PAGEREF _Toc232619463 \h</w:instrText>
+        </w:r>
+        <w:r>
+          <w:rPr>
+            <w:rFonts w:hint="eastAsia"/>
+            <w:noProof/>
+            <w:webHidden/>
+          </w:rPr>
+          <w:instrText xml:space="preserve"> </w:instrText>
+        </w:r>
+        <w:r>
+          <w:rPr>
+            <w:rFonts w:hint="eastAsia"/>
+            <w:noProof/>
+            <w:webHidden/>
+          </w:rPr>
+        </w:r>
+        <w:r>
+          <w:rPr>
+            <w:rFonts w:hint="eastAsia"/>
+            <w:noProof/>
+            <w:webHidden/>
+          </w:rPr>
+          <w:fldChar w:fldCharType="separate"/>
+        </w:r>
+        <w:r>
+          <w:rPr>
+            <w:rFonts w:hint="eastAsia"/>
+            <w:noProof/>
+            <w:webHidden/>
+          </w:rPr>
+          <w:t>13</w:t>
+        </w:r>
+        <w:r>
+          <w:rPr>
+            <w:rFonts w:hint="eastAsia"/>
+            <w:noProof/>
+            <w:webHidden/>
+          </w:rPr>
+          <w:fldChar w:fldCharType="end"/>
+        </w:r>
+      </w:hyperlink>
+    </w:p>
+    <w:p>
+      <w:pPr>
+        <w:pStyle w:val="TOC2"/>
+        <w:tabs>
+          <w:tab w:val="right" w:leader="dot" w:pos="9112"/>
+        </w:tabs>
+        <w:ind w:left="480"/>
+        <w:rPr>
+          <w:rFonts w:hint="eastAsia"/>
+          <w:noProof/>
+        </w:rPr>
+      </w:pPr>
+      <w:hyperlink w:anchor="_Toc232619464" w:history="1">
+        <w:r>
+          <w:rPr>
+            <w:rStyle w:val="aff9"/>
+            <w:noProof/>
+          </w:rPr>
+          <w:t>5.2 功能测试结果</w:t>
+        </w:r>
+        <w:r>
+          <w:rPr>
+            <w:rFonts w:hint="eastAsia"/>
+            <w:noProof/>
+            <w:webHidden/>
+          </w:rPr>
+          <w:tab/>
+        </w:r>
+        <w:r>
+          <w:rPr>
+            <w:rFonts w:hint="eastAsia"/>
+            <w:noProof/>
+            <w:webHidden/>
+          </w:rPr>
+          <w:fldChar w:fldCharType="begin"/>
+        </w:r>
+        <w:r>
+          <w:rPr>
+            <w:rFonts w:hint="eastAsia"/>
+            <w:noProof/>
+            <w:webHidden/>
+          </w:rPr>
+          <w:instrText xml:space="preserve"> </w:instrText>
+        </w:r>
+        <w:r>
+          <w:rPr>
+            <w:noProof/>
+            <w:webHidden/>
+          </w:rPr>
+          <w:instrText>PAGEREF _Toc232619464 \h</w:instrText>
+        </w:r>
+        <w:r>
+          <w:rPr>
+            <w:rFonts w:hint="eastAsia"/>
+            <w:noProof/>
+            <w:webHidden/>
+          </w:rPr>
+          <w:instrText xml:space="preserve"> </w:instrText>
+        </w:r>
+        <w:r>
+          <w:rPr>
+            <w:rFonts w:hint="eastAsia"/>
+            <w:noProof/>
+            <w:webHidden/>
+          </w:rPr>
+        </w:r>
+        <w:r>
+          <w:rPr>
+            <w:rFonts w:hint="eastAsia"/>
+            <w:noProof/>
+            <w:webHidden/>
+          </w:rPr>
+          <w:fldChar w:fldCharType="separate"/>
+        </w:r>
+        <w:r>
+          <w:rPr>
+            <w:rFonts w:hint="eastAsia"/>
+            <w:noProof/>
+            <w:webHidden/>
+          </w:rPr>
+          <w:t>14</w:t>
+        </w:r>
+        <w:r>
+          <w:rPr>
+            <w:rFonts w:hint="eastAsia"/>
+            <w:noProof/>
+            <w:webHidden/>
+          </w:rPr>
+          <w:fldChar w:fldCharType="end"/>
+        </w:r>
+      </w:hyperlink>
+    </w:p>
+    <w:p>
+      <w:pPr>
+        <w:pStyle w:val="TOC2"/>
+        <w:tabs>
+          <w:tab w:val="right" w:leader="dot" w:pos="9112"/>
+        </w:tabs>
+        <w:ind w:left="480"/>
+        <w:rPr>
+          <w:rFonts w:hint="eastAsia"/>
+          <w:noProof/>
+        </w:rPr>
+      </w:pPr>
+      <w:hyperlink w:anchor="_Toc232619465" w:history="1">
+        <w:r>
+          <w:rPr>
+            <w:rStyle w:val="aff9"/>
+            <w:noProof/>
+          </w:rPr>
+          <w:t>5.3 典型问答验证</w:t>
+        </w:r>
+        <w:r>
+          <w:rPr>
+            <w:rFonts w:hint="eastAsia"/>
+            <w:noProof/>
+            <w:webHidden/>
+          </w:rPr>
+          <w:tab/>
+        </w:r>
+        <w:r>
+          <w:rPr>
+            <w:rFonts w:hint="eastAsia"/>
+            <w:noProof/>
+            <w:webHidden/>
+          </w:rPr>
+          <w:fldChar w:fldCharType="begin"/>
+        </w:r>
+        <w:r>
+          <w:rPr>
+            <w:rFonts w:hint="eastAsia"/>
+            <w:noProof/>
+            <w:webHidden/>
+          </w:rPr>
+          <w:instrText xml:space="preserve"> </w:instrText>
+        </w:r>
+        <w:r>
+          <w:rPr>
+            <w:noProof/>
+            <w:webHidden/>
+          </w:rPr>
+          <w:instrText>PAGEREF _Toc232619465 \h</w:instrText>
+        </w:r>
+        <w:r>
+          <w:rPr>
+            <w:rFonts w:hint="eastAsia"/>
+            <w:noProof/>
+            <w:webHidden/>
+          </w:rPr>
+          <w:instrText xml:space="preserve"> </w:instrText>
+        </w:r>
+        <w:r>
+          <w:rPr>
+            <w:rFonts w:hint="eastAsia"/>
+            <w:noProof/>
+            <w:webHidden/>
+          </w:rPr>
+        </w:r>
+        <w:r>
+          <w:rPr>
+            <w:rFonts w:hint="eastAsia"/>
+            <w:noProof/>
+            <w:webHidden/>
+          </w:rPr>
+          <w:fldChar w:fldCharType="separate"/>
+        </w:r>
+        <w:r>
+          <w:rPr>
+            <w:rFonts w:hint="eastAsia"/>
+            <w:noProof/>
+            <w:webHidden/>
+          </w:rPr>
+          <w:t>15</w:t>
+        </w:r>
+        <w:r>
+          <w:rPr>
+            <w:rFonts w:hint="eastAsia"/>
+            <w:noProof/>
+            <w:webHidden/>
+          </w:rPr>
+          <w:fldChar w:fldCharType="end"/>
+        </w:r>
+      </w:hyperlink>
+    </w:p>
+    <w:p>
+      <w:pPr>
+        <w:pStyle w:val="TOC2"/>
+        <w:tabs>
+          <w:tab w:val="right" w:leader="dot" w:pos="9112"/>
+        </w:tabs>
+        <w:ind w:left="480"/>
+        <w:rPr>
+          <w:rFonts w:hint="eastAsia"/>
+          <w:noProof/>
+        </w:rPr>
+      </w:pPr>
+      <w:hyperlink w:anchor="_Toc232619466" w:history="1">
+        <w:r>
+          <w:rPr>
+            <w:rStyle w:val="aff9"/>
+            <w:noProof/>
+          </w:rPr>
+          <w:t>5.4 测试分析</w:t>
+        </w:r>
+        <w:r>
+          <w:rPr>
+            <w:rFonts w:hint="eastAsia"/>
+            <w:noProof/>
+            <w:webHidden/>
+          </w:rPr>
+          <w:tab/>
+        </w:r>
+        <w:r>
+          <w:rPr>
+            <w:rFonts w:hint="eastAsia"/>
+            <w:noProof/>
+            <w:webHidden/>
+          </w:rPr>
+          <w:fldChar w:fldCharType="begin"/>
+        </w:r>
+        <w:r>
+          <w:rPr>
+            <w:rFonts w:hint="eastAsia"/>
+            <w:noProof/>
+            <w:webHidden/>
+          </w:rPr>
+          <w:instrText xml:space="preserve"> </w:instrText>
+        </w:r>
+        <w:r>
+          <w:rPr>
+            <w:noProof/>
+            <w:webHidden/>
+          </w:rPr>
+          <w:instrText>PAGEREF _Toc232619466 \h</w:instrText>
+        </w:r>
+        <w:r>
+          <w:rPr>
+            <w:rFonts w:hint="eastAsia"/>
+            <w:noProof/>
+            <w:webHidden/>
+          </w:rPr>
+          <w:instrText xml:space="preserve"> </w:instrText>
+        </w:r>
+        <w:r>
+          <w:rPr>
+            <w:rFonts w:hint="eastAsia"/>
+            <w:noProof/>
+            <w:webHidden/>
+          </w:rPr>
+        </w:r>
+        <w:r>
+          <w:rPr>
+            <w:rFonts w:hint="eastAsia"/>
+            <w:noProof/>
+            <w:webHidden/>
+          </w:rPr>
+          <w:fldChar w:fldCharType="separate"/>
+        </w:r>
+        <w:r>
+          <w:rPr>
+            <w:rFonts w:hint="eastAsia"/>
+            <w:noProof/>
+            <w:webHidden/>
+          </w:rPr>
+          <w:t>16</w:t>
+        </w:r>
+        <w:r>
+          <w:rPr>
+            <w:rFonts w:hint="eastAsia"/>
+            <w:noProof/>
+            <w:webHidden/>
+          </w:rPr>
+          <w:fldChar w:fldCharType="end"/>
+        </w:r>
+      </w:hyperlink>
+    </w:p>
+    <w:p>
+      <w:pPr>
+        <w:pStyle w:val="TOC2"/>
+        <w:tabs>
+          <w:tab w:val="right" w:leader="dot" w:pos="9112"/>
+        </w:tabs>
+        <w:ind w:left="480"/>
+        <w:rPr>
+          <w:rFonts w:hint="eastAsia"/>
+          <w:noProof/>
+        </w:rPr>
+      </w:pPr>
+      <w:hyperlink w:anchor="_Toc232619467" w:history="1">
+        <w:r>
+          <w:rPr>
+            <w:rStyle w:val="aff9"/>
+            <w:noProof/>
+          </w:rPr>
+          <w:t>5.5 局限性分析</w:t>
+        </w:r>
+        <w:r>
+          <w:rPr>
+            <w:rFonts w:hint="eastAsia"/>
+            <w:noProof/>
+            <w:webHidden/>
+          </w:rPr>
+          <w:tab/>
+        </w:r>
+        <w:r>
+          <w:rPr>
+            <w:rFonts w:hint="eastAsia"/>
+            <w:noProof/>
+            <w:webHidden/>
+          </w:rPr>
+          <w:fldChar w:fldCharType="begin"/>
+        </w:r>
+        <w:r>
+          <w:rPr>
+            <w:rFonts w:hint="eastAsia"/>
+            <w:noProof/>
+            <w:webHidden/>
+          </w:rPr>
+          <w:instrText xml:space="preserve"> </w:instrText>
+        </w:r>
+        <w:r>
+          <w:rPr>
+            <w:noProof/>
+            <w:webHidden/>
+          </w:rPr>
+          <w:instrText>PAGEREF _Toc232619467 \h</w:instrText>
+        </w:r>
+        <w:r>
+          <w:rPr>
+            <w:rFonts w:hint="eastAsia"/>
+            <w:noProof/>
+            <w:webHidden/>
+          </w:rPr>
+          <w:instrText xml:space="preserve"> </w:instrText>
+        </w:r>
+        <w:r>
+          <w:rPr>
+            <w:rFonts w:hint="eastAsia"/>
+            <w:noProof/>
+            <w:webHidden/>
+          </w:rPr>
+        </w:r>
+        <w:r>
+          <w:rPr>
+            <w:rFonts w:hint="eastAsia"/>
+            <w:noProof/>
+            <w:webHidden/>
+          </w:rPr>
+          <w:fldChar w:fldCharType="separate"/>
+        </w:r>
+        <w:r>
+          <w:rPr>
+            <w:rFonts w:hint="eastAsia"/>
+            <w:noProof/>
+            <w:webHidden/>
+          </w:rPr>
+          <w:t>16</w:t>
         </w:r>
         <w:r>
           <w:rPr>
@@ -2781,12 +3165,103 @@
           <w:noProof/>
         </w:rPr>
       </w:pPr>
-      <w:hyperlink w:anchor="_Toc232608905" w:history="1">
+      <w:hyperlink w:anchor="_Toc232619468" w:history="1">
         <w:r>
           <w:rPr>
             <w:rStyle w:val="aff9"/>
             <w:noProof/>
           </w:rPr>
+          <w:t>第6章 总结</w:t>
+        </w:r>
+        <w:r>
+          <w:rPr>
+            <w:rFonts w:hint="eastAsia"/>
+            <w:noProof/>
+            <w:webHidden/>
+          </w:rPr>
+          <w:tab/>
+        </w:r>
+        <w:r>
+          <w:rPr>
+            <w:rFonts w:hint="eastAsia"/>
+            <w:noProof/>
+            <w:webHidden/>
+          </w:rPr>
+          <w:fldChar w:fldCharType="begin"/>
+        </w:r>
+        <w:r>
+          <w:rPr>
+            <w:rFonts w:hint="eastAsia"/>
+            <w:noProof/>
+            <w:webHidden/>
+          </w:rPr>
+          <w:instrText xml:space="preserve"> </w:instrText>
+        </w:r>
+        <w:r>
+          <w:rPr>
+            <w:noProof/>
+            <w:webHidden/>
+          </w:rPr>
+          <w:instrText>PAGEREF _Toc232619468 \h</w:instrText>
+        </w:r>
+        <w:r>
+          <w:rPr>
+            <w:rFonts w:hint="eastAsia"/>
+            <w:noProof/>
+            <w:webHidden/>
+          </w:rPr>
+          <w:instrText xml:space="preserve"> </w:instrText>
+        </w:r>
+        <w:r>
+          <w:rPr>
+            <w:rFonts w:hint="eastAsia"/>
+            <w:noProof/>
+            <w:webHidden/>
+          </w:rPr>
+        </w:r>
+        <w:r>
+          <w:rPr>
+            <w:rFonts w:hint="eastAsia"/>
+            <w:noProof/>
+            <w:webHidden/>
+          </w:rPr>
+          <w:fldChar w:fldCharType="separate"/>
+        </w:r>
+        <w:r>
+          <w:rPr>
+            <w:rFonts w:hint="eastAsia"/>
+            <w:noProof/>
+            <w:webHidden/>
+          </w:rPr>
+          <w:t>16</w:t>
+        </w:r>
+        <w:r>
+          <w:rPr>
+            <w:rFonts w:hint="eastAsia"/>
+            <w:noProof/>
+            <w:webHidden/>
+          </w:rPr>
+          <w:fldChar w:fldCharType="end"/>
+        </w:r>
+      </w:hyperlink>
+    </w:p>
+    <w:p>
+      <w:pPr>
+        <w:pStyle w:val="TOC1"/>
+        <w:tabs>
+          <w:tab w:val="right" w:leader="dot" w:pos="9112"/>
+        </w:tabs>
+        <w:rPr>
+          <w:rFonts w:hint="eastAsia"/>
+          <w:noProof/>
+        </w:rPr>
+      </w:pPr>
+      <w:hyperlink w:anchor="_Toc232619469" w:history="1">
+        <w:r>
+          <w:rPr>
+            <w:rStyle w:val="aff9"/>
+            <w:noProof/>
+          </w:rPr>
           <w:t>参考文献</w:t>
         </w:r>
         <w:r>
@@ -2818,7 +3293,7 @@
             <w:noProof/>
             <w:webHidden/>
           </w:rPr>
-          <w:instrText>PAGEREF _Toc232608905 \h</w:instrText>
+          <w:instrText>PAGEREF _Toc232619469 \h</w:instrText>
         </w:r>
         <w:r>
           <w:rPr>
@@ -2849,7 +3324,7 @@
             <w:noProof/>
             <w:webHidden/>
           </w:rPr>
-          <w:t>11</w:t>
+          <w:t>17</w:t>
         </w:r>
         <w:r>
           <w:rPr>
@@ -2891,7 +3366,7 @@
       <w:pPr>
         <w:pStyle w:val="1"/>
       </w:pPr>
-      <w:bookmarkStart w:id="0" w:name="_Toc232608882"/>
+      <w:bookmarkStart w:id="0" w:name="_Toc232619441"/>
       <w:r>
         <w:lastRenderedPageBreak/>
         <w:t>第</w:t>
@@ -2914,7 +3389,7 @@
       <w:pPr>
         <w:pStyle w:val="21"/>
       </w:pPr>
-      <w:bookmarkStart w:id="1" w:name="_Toc232608883"/>
+      <w:bookmarkStart w:id="1" w:name="_Toc232619442"/>
       <w:r>
         <w:t xml:space="preserve">1.1 </w:t>
       </w:r>
@@ -2974,26 +3449,188 @@
         <w:rPr>
           <w:rFonts w:ascii="Times New Roman" w:hAnsi="Times New Roman"/>
         </w:rPr>
-        <w:t>，将团队知识沉淀为可检索、可引用、可持续扩展的知识库，并通过标准接口为比赛平台、</w:t>
-      </w:r>
-      <w:r>
-        <w:rPr>
-          <w:rFonts w:ascii="Times New Roman" w:hAnsi="Times New Roman"/>
-        </w:rPr>
-        <w:t xml:space="preserve">Web </w:t>
-      </w:r>
-      <w:r>
-        <w:rPr>
-          <w:rFonts w:ascii="Times New Roman" w:hAnsi="Times New Roman"/>
-        </w:rPr>
-        <w:t>前端或外部系统提供统一问答服务。它不仅能回答通用问题，还能结合已投喂资料给出有来源的排查建议，从而降低一线支持和运维值班的重复劳动成本。</w:t>
+        <w:t>，将团队知识沉淀为可检索、可引用、可持续扩展的知识库，并通过统一问答接口为</w:t>
+      </w:r>
+      <w:r>
+        <w:rPr>
+          <w:rFonts w:ascii="Times New Roman" w:hAnsi="Times New Roman"/>
+        </w:rPr>
+        <w:t xml:space="preserve"> Web </w:t>
+      </w:r>
+      <w:r>
+        <w:rPr>
+          <w:rFonts w:ascii="Times New Roman" w:hAnsi="Times New Roman"/>
+        </w:rPr>
+        <w:t>前端、业务系统或外部评测系统提供服务。它不仅能回答通用问题，还能结合已投喂资料给出有来源的排查建议，从而降低一线支持和运维值班的重复劳动成本。</w:t>
       </w:r>
     </w:p>
     <w:p>
       <w:pPr>
+        <w:ind w:firstLine="482"/>
+        <w:jc w:val="both"/>
+        <w:rPr>
+          <w:rFonts w:hint="eastAsia"/>
+        </w:rPr>
+      </w:pPr>
+      <w:r>
+        <w:rPr>
+          <w:rFonts w:ascii="Times New Roman" w:hAnsi="Times New Roman"/>
+        </w:rPr>
+        <w:t>从业务价值看，该系统的核心意义并不只是让大模型能够</w:t>
+      </w:r>
+      <w:r>
+        <w:rPr>
+          <w:rFonts w:ascii="Times New Roman" w:hAnsi="Times New Roman"/>
+        </w:rPr>
+        <w:t>“</w:t>
+      </w:r>
+      <w:r>
+        <w:rPr>
+          <w:rFonts w:ascii="Times New Roman" w:hAnsi="Times New Roman"/>
+        </w:rPr>
+        <w:t>聊天</w:t>
+      </w:r>
+      <w:r>
+        <w:rPr>
+          <w:rFonts w:ascii="Times New Roman" w:hAnsi="Times New Roman"/>
+        </w:rPr>
+        <w:t>”</w:t>
+      </w:r>
+      <w:r>
+        <w:rPr>
+          <w:rFonts w:ascii="Times New Roman" w:hAnsi="Times New Roman"/>
+        </w:rPr>
+        <w:t>，而是把原来依赖人工经验的检索、归纳和排查过程转化为可复用的软件能力。对于客服人员，系统可以快速定位</w:t>
+      </w:r>
+      <w:r>
+        <w:rPr>
+          <w:rFonts w:ascii="Times New Roman" w:hAnsi="Times New Roman"/>
+        </w:rPr>
+        <w:t xml:space="preserve"> FAQ </w:t>
+      </w:r>
+      <w:r>
+        <w:rPr>
+          <w:rFonts w:ascii="Times New Roman" w:hAnsi="Times New Roman"/>
+        </w:rPr>
+        <w:t>和产品说明，减少重复解释；对于售后人员，系统可以根据</w:t>
+      </w:r>
+      <w:r>
+        <w:rPr>
+          <w:rFonts w:ascii="Times New Roman" w:hAnsi="Times New Roman"/>
+        </w:rPr>
+        <w:t xml:space="preserve"> SLA</w:t>
+      </w:r>
+      <w:r>
+        <w:rPr>
+          <w:rFonts w:ascii="Times New Roman" w:hAnsi="Times New Roman"/>
+        </w:rPr>
+        <w:t>、工单优先级和升级策略给出处理建议；对于运维人员，系统可以把告警说明、日志字段、指标含义和历史排查流程放在同一个上下文中，辅助形成结构化判断。不同岗位虽然关注点不同，但底层都依赖</w:t>
+      </w:r>
+      <w:r>
+        <w:rPr>
+          <w:rFonts w:ascii="Times New Roman" w:hAnsi="Times New Roman"/>
+        </w:rPr>
+        <w:t>“</w:t>
+      </w:r>
+      <w:r>
+        <w:rPr>
+          <w:rFonts w:ascii="Times New Roman" w:hAnsi="Times New Roman"/>
+        </w:rPr>
+        <w:t>准确找到相关资料、理解问题语境、输出可执行建议</w:t>
+      </w:r>
+      <w:r>
+        <w:rPr>
+          <w:rFonts w:ascii="Times New Roman" w:hAnsi="Times New Roman"/>
+        </w:rPr>
+        <w:t>”</w:t>
+      </w:r>
+      <w:r>
+        <w:rPr>
+          <w:rFonts w:ascii="Times New Roman" w:hAnsi="Times New Roman"/>
+        </w:rPr>
+        <w:t>这一共同能力。</w:t>
+      </w:r>
+    </w:p>
+    <w:p>
+      <w:pPr>
+        <w:ind w:firstLine="482"/>
+        <w:jc w:val="both"/>
+        <w:rPr>
+          <w:rFonts w:hint="eastAsia"/>
+        </w:rPr>
+      </w:pPr>
+      <w:r>
+        <w:rPr>
+          <w:rFonts w:ascii="Times New Roman" w:hAnsi="Times New Roman"/>
+        </w:rPr>
+        <w:t>从知识管理角度看，传统文档库往往只解决</w:t>
+      </w:r>
+      <w:r>
+        <w:rPr>
+          <w:rFonts w:ascii="Times New Roman" w:hAnsi="Times New Roman"/>
+        </w:rPr>
+        <w:t>“</w:t>
+      </w:r>
+      <w:r>
+        <w:rPr>
+          <w:rFonts w:ascii="Times New Roman" w:hAnsi="Times New Roman"/>
+        </w:rPr>
+        <w:t>存放</w:t>
+      </w:r>
+      <w:r>
+        <w:rPr>
+          <w:rFonts w:ascii="Times New Roman" w:hAnsi="Times New Roman"/>
+        </w:rPr>
+        <w:t>”</w:t>
+      </w:r>
+      <w:r>
+        <w:rPr>
+          <w:rFonts w:ascii="Times New Roman" w:hAnsi="Times New Roman"/>
+        </w:rPr>
+        <w:t>问题，没有解决</w:t>
+      </w:r>
+      <w:r>
+        <w:rPr>
+          <w:rFonts w:ascii="Times New Roman" w:hAnsi="Times New Roman"/>
+        </w:rPr>
+        <w:t>“</w:t>
+      </w:r>
+      <w:r>
+        <w:rPr>
+          <w:rFonts w:ascii="Times New Roman" w:hAnsi="Times New Roman"/>
+        </w:rPr>
+        <w:t>使用</w:t>
+      </w:r>
+      <w:r>
+        <w:rPr>
+          <w:rFonts w:ascii="Times New Roman" w:hAnsi="Times New Roman"/>
+        </w:rPr>
+        <w:t>”</w:t>
+      </w:r>
+      <w:r>
+        <w:rPr>
+          <w:rFonts w:ascii="Times New Roman" w:hAnsi="Times New Roman"/>
+        </w:rPr>
+        <w:t>问题。资料越多，人工检索成本越高，新成员越难判断哪一段内容真正适用于当前问题。</w:t>
+      </w:r>
+      <w:r>
+        <w:rPr>
+          <w:rFonts w:ascii="Times New Roman" w:hAnsi="Times New Roman"/>
+        </w:rPr>
+        <w:t xml:space="preserve">RAG </w:t>
+      </w:r>
+      <w:r>
+        <w:rPr>
+          <w:rFonts w:ascii="Times New Roman" w:hAnsi="Times New Roman"/>
+        </w:rPr>
+        <w:t>方案使知识库从静态文件集合变成可计算的语义索引，用户不需要记住文件名或目录位置，只需要用自然语言描述问题，系统即可召回相关片段并组织回答。这种方式既保留了企业内部知识的确定性，又利用了大模型在语言理解、总结和表达上的优势。</w:t>
+      </w:r>
+    </w:p>
+    <w:p>
+      <w:pPr>
         <w:pStyle w:val="21"/>
       </w:pPr>
-      <w:bookmarkStart w:id="2" w:name="_Toc232608884"/>
+      <w:bookmarkStart w:id="2" w:name="_Toc232619443"/>
       <w:r>
         <w:t xml:space="preserve">1.2 </w:t>
       </w:r>
@@ -3077,6 +3714,7 @@
         <w:rPr>
           <w:rFonts w:ascii="Times New Roman" w:hAnsi="Times New Roman"/>
         </w:rPr>
+        <w:lastRenderedPageBreak/>
         <w:t>第二，智能体需要具备可控的工具调用能力。客服和运维问题并不总是一次检索即可解决，部分问题需要查询日志、指标或结合当前时间进行判断。系统需要让模型在回答前判断是否调用工具，并把工具返回结果纳入推理过程。</w:t>
       </w:r>
     </w:p>
@@ -3092,14 +3730,29 @@
         <w:rPr>
           <w:rFonts w:ascii="Times New Roman" w:hAnsi="Times New Roman"/>
         </w:rPr>
-        <w:t>第三，工程系统需要可演示、可部署、可验证。为了参加比赛，系统不能只停留在本地原型，需要具备公网访问能力、基础鉴权、接口说明、运行说明、验证报告、截图材料和演示脚本。</w:t>
+        <w:t>第三，工程系统需要可演示、可部署、可验证。系统不能只停留在本地原型，需要具备公网访问能力、基础鉴权、接口说明、运行说明、验证报告、截图材料和演示脚本，使功能链路能够被完整复现。</w:t>
       </w:r>
     </w:p>
     <w:p>
       <w:pPr>
+        <w:ind w:firstLine="482"/>
+        <w:jc w:val="both"/>
+        <w:rPr>
+          <w:rFonts w:hint="eastAsia"/>
+        </w:rPr>
+      </w:pPr>
+      <w:r>
+        <w:rPr>
+          <w:rFonts w:ascii="Times New Roman" w:hAnsi="Times New Roman"/>
+        </w:rPr>
+        <w:t>第四，系统还需要处理知识更新与安全边界问题。知识库资料会随着业务变化不断调整，如果每次更新都依赖重新训练模型，成本和周期都不可接受；因此系统需要支持文档级更新和增量投喂。与此同时，运维场景中的处理建议可能涉及退款、扩容、重启服务等高风险动作，智能体应当优先输出诊断依据和操作清单，而不是直接执行生产变更。该边界设计使系统更适合作为辅助决策工具，避免把不确定的模型输出直接变成不可逆操作。</w:t>
+      </w:r>
+    </w:p>
+    <w:p>
+      <w:pPr>
         <w:pStyle w:val="21"/>
       </w:pPr>
-      <w:bookmarkStart w:id="3" w:name="_Toc232608885"/>
+      <w:bookmarkStart w:id="3" w:name="_Toc232619444"/>
       <w:r>
         <w:t xml:space="preserve">1.3 </w:t>
       </w:r>
@@ -3251,14 +3904,13 @@
         <w:rPr>
           <w:rFonts w:ascii="Times New Roman" w:hAnsi="Times New Roman"/>
         </w:rPr>
-        <w:lastRenderedPageBreak/>
         <w:t xml:space="preserve">• </w:t>
       </w:r>
       <w:r>
         <w:rPr>
           <w:rFonts w:ascii="Times New Roman" w:hAnsi="Times New Roman"/>
         </w:rPr>
-        <w:t>多模态扩展：比赛接口支持图片字段，可将告警截图、日志截图和支付凭证截图的观察结果交给智能体继续分析。</w:t>
+        <w:t>多模态扩展：统一问答接口支持图片字段，可将告警截图、日志截图和支付凭证截图的观察结果交给智能体继续分析。</w:t>
       </w:r>
     </w:p>
     <w:p>
@@ -3278,7 +3930,7 @@
         <w:rPr>
           <w:rFonts w:ascii="Times New Roman" w:hAnsi="Times New Roman"/>
         </w:rPr>
-        <w:t>公网部署与标准接口：系统已部署到云服务器，通过</w:t>
+        <w:t>公网部署与标准服务：系统已部署到云服务器，通过</w:t>
       </w:r>
       <w:r>
         <w:rPr>
@@ -3314,46 +3966,207 @@
         <w:rPr>
           <w:rFonts w:ascii="Times New Roman" w:hAnsi="Times New Roman"/>
         </w:rPr>
-        <w:t>问答接口。</w:t>
+        <w:t>问答服务。</w:t>
       </w:r>
     </w:p>
     <w:p>
       <w:pPr>
-        <w:pStyle w:val="1"/>
-      </w:pPr>
-      <w:bookmarkStart w:id="4" w:name="_Toc232608886"/>
-      <w:r>
-        <w:t>第</w:t>
-      </w:r>
-      <w:r>
-        <w:t>2</w:t>
-      </w:r>
-      <w:r>
-        <w:t>章</w:t>
-      </w:r>
-      <w:r>
-        <w:t xml:space="preserve"> </w:t>
-      </w:r>
-      <w:r>
-        <w:t>方案论证与设计</w:t>
+        <w:pStyle w:val="21"/>
+      </w:pPr>
+      <w:bookmarkStart w:id="4" w:name="_Toc232619445"/>
+      <w:r>
+        <w:t xml:space="preserve">1.4 </w:t>
+      </w:r>
+      <w:r>
+        <w:t>需求分析</w:t>
       </w:r>
       <w:bookmarkEnd w:id="4"/>
     </w:p>
     <w:p>
       <w:pPr>
-        <w:pStyle w:val="21"/>
-      </w:pPr>
-      <w:bookmarkStart w:id="5" w:name="_Toc232608887"/>
-      <w:r>
-        <w:t xml:space="preserve">2.1 </w:t>
-      </w:r>
-      <w:r>
-        <w:t>总体方案</w:t>
+        <w:ind w:firstLine="482"/>
+        <w:jc w:val="both"/>
+        <w:rPr>
+          <w:rFonts w:hint="eastAsia"/>
+        </w:rPr>
+      </w:pPr>
+      <w:r>
+        <w:rPr>
+          <w:rFonts w:ascii="Times New Roman" w:hAnsi="Times New Roman"/>
+        </w:rPr>
+        <w:t>结合目标场景，系统需求可分为功能需求、性能需求、可维护性需求和安全需求四类。功能需求方面，系统应支持自然语言问答、知识库资料上传、向量检索、引用来源展示、多轮会话、图片字段输入以及知识库文件管理。性能需求方面，常见问题应在可接受时间内返回结果，文档检索应尽量减少无关片段干扰，向量数据库应能够支撑后续资料规模扩展。可维护性方面，配置项应外置，知识库资料应可替换，前后端职责应清</w:t>
+      </w:r>
+      <w:r>
+        <w:rPr>
+          <w:rFonts w:ascii="Times New Roman" w:hAnsi="Times New Roman"/>
+        </w:rPr>
+        <w:lastRenderedPageBreak/>
+        <w:t>晰，部署脚本和运行说明应便于复现。安全方面，系统不应在仓库、论文或截图中暴露真实</w:t>
+      </w:r>
+      <w:r>
+        <w:rPr>
+          <w:rFonts w:ascii="Times New Roman" w:hAnsi="Times New Roman"/>
+        </w:rPr>
+        <w:t xml:space="preserve"> API Key </w:t>
+      </w:r>
+      <w:r>
+        <w:rPr>
+          <w:rFonts w:ascii="Times New Roman" w:hAnsi="Times New Roman"/>
+        </w:rPr>
+        <w:t>和长期访问</w:t>
+      </w:r>
+      <w:r>
+        <w:rPr>
+          <w:rFonts w:ascii="Times New Roman" w:hAnsi="Times New Roman"/>
+        </w:rPr>
+        <w:t xml:space="preserve"> Token</w:t>
+      </w:r>
+      <w:r>
+        <w:rPr>
+          <w:rFonts w:ascii="Times New Roman" w:hAnsi="Times New Roman"/>
+        </w:rPr>
+        <w:t>，管理类接口也应具备逐步增强鉴权的空间。</w:t>
+      </w:r>
+    </w:p>
+    <w:p>
+      <w:pPr>
+        <w:ind w:firstLine="482"/>
+        <w:jc w:val="both"/>
+        <w:rPr>
+          <w:rFonts w:hint="eastAsia"/>
+        </w:rPr>
+      </w:pPr>
+      <w:r>
+        <w:rPr>
+          <w:rFonts w:ascii="Times New Roman" w:hAnsi="Times New Roman"/>
+        </w:rPr>
+        <w:t>在问答质量上，系统需要兼顾准确性、完整性和可解释性。准确性要求答案与知识库内容一致，不能把模型常识误当成业务规则；完整性要求答案不仅给出结论，还要说明排查顺序、关键字段和下一步动作；可解释性要求答案能够指出参考了哪些资料，尤其在售后</w:t>
+      </w:r>
+      <w:r>
+        <w:rPr>
+          <w:rFonts w:ascii="Times New Roman" w:hAnsi="Times New Roman"/>
+        </w:rPr>
+        <w:t xml:space="preserve"> SLA</w:t>
+      </w:r>
+      <w:r>
+        <w:rPr>
+          <w:rFonts w:ascii="Times New Roman" w:hAnsi="Times New Roman"/>
+        </w:rPr>
+        <w:t>、支付异常和运维告警场景中，使用者往往需要知道建议的依据来自哪份手册。基于上述需求，系统最终选择以</w:t>
+      </w:r>
+      <w:r>
+        <w:rPr>
+          <w:rFonts w:ascii="Times New Roman" w:hAnsi="Times New Roman"/>
+        </w:rPr>
+        <w:t xml:space="preserve"> RAG </w:t>
+      </w:r>
+      <w:r>
+        <w:rPr>
+          <w:rFonts w:ascii="Times New Roman" w:hAnsi="Times New Roman"/>
+        </w:rPr>
+        <w:t>为事实来源，以</w:t>
+      </w:r>
+      <w:r>
+        <w:rPr>
+          <w:rFonts w:ascii="Times New Roman" w:hAnsi="Times New Roman"/>
+        </w:rPr>
+        <w:t xml:space="preserve"> ReAct </w:t>
+      </w:r>
+      <w:r>
+        <w:rPr>
+          <w:rFonts w:ascii="Times New Roman" w:hAnsi="Times New Roman"/>
+        </w:rPr>
+        <w:t>工具调用为推理组织方式，以前端引用卡片作为解释入口。</w:t>
+      </w:r>
+    </w:p>
+    <w:p>
+      <w:pPr>
+        <w:ind w:firstLine="482"/>
+        <w:jc w:val="both"/>
+        <w:rPr>
+          <w:rFonts w:hint="eastAsia"/>
+        </w:rPr>
+      </w:pPr>
+      <w:r>
+        <w:rPr>
+          <w:rFonts w:ascii="Times New Roman" w:hAnsi="Times New Roman"/>
+        </w:rPr>
+        <w:t>系统的非功能需求同样重要。由于该项目需要在个人电脑和云服务器两类环境运行，因此依赖组件必须相对通用，启动步骤不能过度复杂。后端采用</w:t>
+      </w:r>
+      <w:r>
+        <w:rPr>
+          <w:rFonts w:ascii="Times New Roman" w:hAnsi="Times New Roman"/>
+        </w:rPr>
+        <w:t xml:space="preserve"> Spring Boot </w:t>
+      </w:r>
+      <w:r>
+        <w:rPr>
+          <w:rFonts w:ascii="Times New Roman" w:hAnsi="Times New Roman"/>
+        </w:rPr>
+        <w:t>是为了获得成熟的配置、</w:t>
+      </w:r>
+      <w:r>
+        <w:rPr>
+          <w:rFonts w:ascii="Times New Roman" w:hAnsi="Times New Roman"/>
+        </w:rPr>
+        <w:t xml:space="preserve">REST </w:t>
+      </w:r>
+      <w:r>
+        <w:rPr>
+          <w:rFonts w:ascii="Times New Roman" w:hAnsi="Times New Roman"/>
+        </w:rPr>
+        <w:t>接口和服务部署能力；向量库采用</w:t>
+      </w:r>
+      <w:r>
+        <w:rPr>
+          <w:rFonts w:ascii="Times New Roman" w:hAnsi="Times New Roman"/>
+        </w:rPr>
+        <w:t xml:space="preserve"> Docker </w:t>
+      </w:r>
+      <w:r>
+        <w:rPr>
+          <w:rFonts w:ascii="Times New Roman" w:hAnsi="Times New Roman"/>
+        </w:rPr>
+        <w:t>方式部署，是为了降低本地和云端环境差异；前端直接由后端承载，是为了减少额外静态资源服务的部署成本。这样的取舍使项目更适合作为可学习、可修改、可演示的完整工程，而不是只在某一台机器上可运行的实验脚本。</w:t>
+      </w:r>
+    </w:p>
+    <w:p>
+      <w:pPr>
+        <w:pStyle w:val="1"/>
+      </w:pPr>
+      <w:bookmarkStart w:id="5" w:name="_Toc232619446"/>
+      <w:r>
+        <w:t>第</w:t>
+      </w:r>
+      <w:r>
+        <w:t>2</w:t>
+      </w:r>
+      <w:r>
+        <w:t>章</w:t>
+      </w:r>
+      <w:r>
+        <w:t xml:space="preserve"> </w:t>
+      </w:r>
+      <w:r>
+        <w:t>方案论证与设计</w:t>
       </w:r>
       <w:bookmarkEnd w:id="5"/>
     </w:p>
     <w:p>
       <w:pPr>
+        <w:pStyle w:val="21"/>
+      </w:pPr>
+      <w:bookmarkStart w:id="6" w:name="_Toc232619447"/>
+      <w:r>
+        <w:t xml:space="preserve">2.1 </w:t>
+      </w:r>
+      <w:r>
+        <w:t>总体方案</w:t>
+      </w:r>
+      <w:bookmarkEnd w:id="6"/>
+    </w:p>
+    <w:p>
+      <w:pPr>
         <w:ind w:firstLine="482"/>
         <w:jc w:val="both"/>
         <w:rPr>
@@ -3427,8 +4240,9 @@
         <w:rPr>
           <w:noProof/>
         </w:rPr>
+        <w:lastRenderedPageBreak/>
         <w:drawing>
-          <wp:inline distT="0" distB="0" distL="0" distR="0" wp14:anchorId="6750FB21" wp14:editId="28BF0C36">
+          <wp:inline distT="0" distB="0" distL="0" distR="0" wp14:anchorId="7E476F35" wp14:editId="15824030">
             <wp:extent cx="5580000" cy="3138750"/>
             <wp:effectExtent l="0" t="0" r="0" b="0"/>
             <wp:docPr id="1" name="Picture 1"/>
@@ -3678,7 +4492,7 @@
                 <w:rFonts w:ascii="Times New Roman" w:hAnsi="Times New Roman"/>
                 <w:sz w:val="21"/>
               </w:rPr>
-              <w:t>比赛接口</w:t>
+              <w:t>问答入口</w:t>
             </w:r>
           </w:p>
         </w:tc>
@@ -4216,21 +5030,21 @@
           <w:color w:val="5A5A5A"/>
           <w:sz w:val="18"/>
         </w:rPr>
-        <w:t>资料来源：项目设计与验证材料整理。</w:t>
+        <w:t>资料来源：作者根据项目设计、代码实现与验证结果整理。</w:t>
       </w:r>
     </w:p>
     <w:p>
       <w:pPr>
         <w:pStyle w:val="21"/>
       </w:pPr>
-      <w:bookmarkStart w:id="6" w:name="_Toc232608888"/>
+      <w:bookmarkStart w:id="7" w:name="_Toc232619448"/>
       <w:r>
         <w:t xml:space="preserve">2.2 </w:t>
       </w:r>
       <w:r>
         <w:t>技术选型论证</w:t>
       </w:r>
-      <w:bookmarkEnd w:id="6"/>
+      <w:bookmarkEnd w:id="7"/>
     </w:p>
     <w:p>
       <w:pPr>
@@ -4825,7 +5639,7 @@
                 <w:rFonts w:ascii="Times New Roman" w:hAnsi="Times New Roman"/>
                 <w:sz w:val="21"/>
               </w:rPr>
-              <w:t>标准接口，便于比赛评测和系统集成</w:t>
+              <w:t>标准接口，便于外部评测和系统集成</w:t>
             </w:r>
           </w:p>
         </w:tc>
@@ -4925,21 +5739,21 @@
           <w:color w:val="5A5A5A"/>
           <w:sz w:val="18"/>
         </w:rPr>
-        <w:t>资料来源：项目设计与验证材料整理。</w:t>
+        <w:t>资料来源：作者根据项目设计、代码实现与验证结果整理。</w:t>
       </w:r>
     </w:p>
     <w:p>
       <w:pPr>
         <w:pStyle w:val="21"/>
       </w:pPr>
-      <w:bookmarkStart w:id="7" w:name="_Toc232608889"/>
+      <w:bookmarkStart w:id="8" w:name="_Toc232619449"/>
       <w:r>
         <w:t xml:space="preserve">2.3 </w:t>
       </w:r>
       <w:r>
         <w:t>云端部署方案</w:t>
       </w:r>
-      <w:bookmarkEnd w:id="7"/>
+      <w:bookmarkEnd w:id="8"/>
     </w:p>
     <w:p>
       <w:pPr>
@@ -5113,7 +5927,7 @@
           <w:noProof/>
         </w:rPr>
         <w:drawing>
-          <wp:inline distT="0" distB="0" distL="0" distR="0" wp14:anchorId="44444AAF" wp14:editId="0AF1F7F7">
+          <wp:inline distT="0" distB="0" distL="0" distR="0" wp14:anchorId="40E535B3" wp14:editId="3449D9B6">
             <wp:extent cx="5328000" cy="3386124"/>
             <wp:effectExtent l="0" t="0" r="0" b="0"/>
             <wp:docPr id="2" name="Picture 2"/>
@@ -5199,36 +6013,14 @@
     </w:p>
     <w:p>
       <w:pPr>
-        <w:pStyle w:val="1"/>
-      </w:pPr>
-      <w:bookmarkStart w:id="8" w:name="_Toc232608890"/>
-      <w:r>
-        <w:t>第</w:t>
-      </w:r>
-      <w:r>
-        <w:t>3</w:t>
-      </w:r>
-      <w:r>
-        <w:t>章</w:t>
-      </w:r>
-      <w:r>
-        <w:t xml:space="preserve"> </w:t>
-      </w:r>
-      <w:r>
-        <w:t>原理分析与系统架构</w:t>
-      </w:r>
-      <w:bookmarkEnd w:id="8"/>
-    </w:p>
-    <w:p>
-      <w:pPr>
         <w:pStyle w:val="21"/>
       </w:pPr>
-      <w:bookmarkStart w:id="9" w:name="_Toc232608891"/>
-      <w:r>
-        <w:t xml:space="preserve">3.1 RAG </w:t>
-      </w:r>
-      <w:r>
-        <w:t>检索增强生成原理</w:t>
+      <w:bookmarkStart w:id="9" w:name="_Toc232619450"/>
+      <w:r>
+        <w:t xml:space="preserve">2.4 </w:t>
+      </w:r>
+      <w:r>
+        <w:t>设计原则</w:t>
       </w:r>
       <w:bookmarkEnd w:id="9"/>
     </w:p>
@@ -5244,78 +6036,185 @@
         <w:rPr>
           <w:rFonts w:ascii="Times New Roman" w:hAnsi="Times New Roman"/>
         </w:rPr>
-        <w:t xml:space="preserve">RAG </w:t>
-      </w:r>
-      <w:r>
-        <w:rPr>
-          <w:rFonts w:ascii="Times New Roman" w:hAnsi="Times New Roman"/>
-        </w:rPr>
-        <w:t>的核心思想是先检索再生成。系统在资料投喂阶段将</w:t>
-      </w:r>
-      <w:r>
-        <w:rPr>
-          <w:rFonts w:ascii="Times New Roman" w:hAnsi="Times New Roman"/>
-        </w:rPr>
-        <w:t xml:space="preserve"> FAQ</w:t>
-      </w:r>
-      <w:r>
-        <w:rPr>
-          <w:rFonts w:ascii="Times New Roman" w:hAnsi="Times New Roman"/>
-        </w:rPr>
-        <w:t>、售后政策、支付排查手册、运维告警流程、日志指标说明等资料切分为语义片段，然后调用</w:t>
-      </w:r>
-      <w:r>
-        <w:rPr>
-          <w:rFonts w:ascii="Times New Roman" w:hAnsi="Times New Roman"/>
-        </w:rPr>
-        <w:t xml:space="preserve"> Embedding </w:t>
+        <w:t>系统设计遵循四项原则。第一是事实优先原则，即回答应尽量基于知识库召回内容，而不是仅依赖模型已有知识；当知识库没有明确资料时，系统应倾向于提示需要补充信息，而不是编造不存在的制度。第二是可追溯原则，即每个关键结论都应能够回到来源文件、标题或片段，便于人工复核。第三是低耦合原则，知识库检索、模型调用、文件</w:t>
       </w:r>
       <w:r>
         <w:rPr>
           <w:rFonts w:ascii="Times New Roman" w:hAnsi="Times New Roman"/>
         </w:rPr>
         <w:lastRenderedPageBreak/>
-        <w:t>模型生成向量并写入</w:t>
-      </w:r>
-      <w:r>
-        <w:rPr>
-          <w:rFonts w:ascii="Times New Roman" w:hAnsi="Times New Roman"/>
-        </w:rPr>
-        <w:t xml:space="preserve"> Milvus</w:t>
-      </w:r>
-      <w:r>
-        <w:rPr>
-          <w:rFonts w:ascii="Times New Roman" w:hAnsi="Times New Roman"/>
-        </w:rPr>
-        <w:t>。用户提问时，系统将问题同样向量化，在</w:t>
-      </w:r>
-      <w:r>
-        <w:rPr>
-          <w:rFonts w:ascii="Times New Roman" w:hAnsi="Times New Roman"/>
-        </w:rPr>
-        <w:t xml:space="preserve"> Milvus </w:t>
-      </w:r>
-      <w:r>
-        <w:rPr>
-          <w:rFonts w:ascii="Times New Roman" w:hAnsi="Times New Roman"/>
-        </w:rPr>
-        <w:t>中按相似度召回</w:t>
-      </w:r>
-      <w:r>
-        <w:rPr>
-          <w:rFonts w:ascii="Times New Roman" w:hAnsi="Times New Roman"/>
-        </w:rPr>
-        <w:t xml:space="preserve"> TopK </w:t>
-      </w:r>
-      <w:r>
-        <w:rPr>
-          <w:rFonts w:ascii="Times New Roman" w:hAnsi="Times New Roman"/>
-        </w:rPr>
-        <w:t>片段，再把片段内容、来源信息和用户问题拼接为模型上下文，使回答受到检索事实约束。</w:t>
+        <w:t>上传、前端展示和部署脚本分别承担独立职责，后续替换模型或向量库时不需要重写全部业务逻辑。第四是人机协同原则，系统负责收集信息、整理依据和给出建议，涉及生产变更时仍由人工确认。</w:t>
       </w:r>
     </w:p>
     <w:p>
       <w:pPr>
+        <w:ind w:firstLine="482"/>
+        <w:jc w:val="both"/>
+        <w:rPr>
+          <w:rFonts w:hint="eastAsia"/>
+        </w:rPr>
+      </w:pPr>
+      <w:r>
+        <w:rPr>
+          <w:rFonts w:ascii="Times New Roman" w:hAnsi="Times New Roman"/>
+        </w:rPr>
+        <w:t>基于这些原则，系统没有选择重训练专用模型，而是采用</w:t>
+      </w:r>
+      <w:r>
+        <w:rPr>
+          <w:rFonts w:ascii="Times New Roman" w:hAnsi="Times New Roman"/>
+        </w:rPr>
+        <w:t xml:space="preserve"> RAG </w:t>
+      </w:r>
+      <w:r>
+        <w:rPr>
+          <w:rFonts w:ascii="Times New Roman" w:hAnsi="Times New Roman"/>
+        </w:rPr>
+        <w:t>与工具调用结合的轻量方案。对于中小规模业务知识库而言，重新训练模型不仅数据准备成本高，而且难以随业务手册快速变化；</w:t>
+      </w:r>
+      <w:r>
+        <w:rPr>
+          <w:rFonts w:ascii="Times New Roman" w:hAnsi="Times New Roman"/>
+        </w:rPr>
+        <w:t xml:space="preserve">RAG </w:t>
+      </w:r>
+      <w:r>
+        <w:rPr>
+          <w:rFonts w:ascii="Times New Roman" w:hAnsi="Times New Roman"/>
+        </w:rPr>
+        <w:t>则可以在资料更新后重新索引片段，使系统立即获得新知识。对于复杂排查问题，单次检索可能不足以覆盖全部上下文，因此在</w:t>
+      </w:r>
+      <w:r>
+        <w:rPr>
+          <w:rFonts w:ascii="Times New Roman" w:hAnsi="Times New Roman"/>
+        </w:rPr>
+        <w:t xml:space="preserve"> RAG </w:t>
+      </w:r>
+      <w:r>
+        <w:rPr>
+          <w:rFonts w:ascii="Times New Roman" w:hAnsi="Times New Roman"/>
+        </w:rPr>
+        <w:t>外层加入智能体编排，让模型可以结合日志、指标、时间和视觉观察结果逐步形成答案。</w:t>
+      </w:r>
+    </w:p>
+    <w:p>
+      <w:pPr>
+        <w:pStyle w:val="1"/>
+      </w:pPr>
+      <w:bookmarkStart w:id="10" w:name="_Toc232619451"/>
+      <w:r>
+        <w:t>第</w:t>
+      </w:r>
+      <w:r>
+        <w:t>3</w:t>
+      </w:r>
+      <w:r>
+        <w:t>章</w:t>
+      </w:r>
+      <w:r>
+        <w:t xml:space="preserve"> </w:t>
+      </w:r>
+      <w:r>
+        <w:t>原理分析与系统架构</w:t>
+      </w:r>
+      <w:bookmarkEnd w:id="10"/>
+    </w:p>
+    <w:p>
+      <w:pPr>
+        <w:pStyle w:val="21"/>
+      </w:pPr>
+      <w:bookmarkStart w:id="11" w:name="_Toc232619452"/>
+      <w:r>
+        <w:t xml:space="preserve">3.1 RAG </w:t>
+      </w:r>
+      <w:r>
+        <w:t>检索增强生成原理</w:t>
+      </w:r>
+      <w:bookmarkEnd w:id="11"/>
+    </w:p>
+    <w:p>
+      <w:pPr>
+        <w:ind w:firstLine="482"/>
+        <w:jc w:val="both"/>
+        <w:rPr>
+          <w:rFonts w:hint="eastAsia"/>
+        </w:rPr>
+      </w:pPr>
+      <w:r>
+        <w:rPr>
+          <w:rFonts w:ascii="Times New Roman" w:hAnsi="Times New Roman"/>
+        </w:rPr>
+        <w:t xml:space="preserve">RAG </w:t>
+      </w:r>
+      <w:r>
+        <w:rPr>
+          <w:rFonts w:ascii="Times New Roman" w:hAnsi="Times New Roman"/>
+        </w:rPr>
+        <w:t>的核心思想是先检索再生成。系统在资料投喂阶段将</w:t>
+      </w:r>
+      <w:r>
+        <w:rPr>
+          <w:rFonts w:ascii="Times New Roman" w:hAnsi="Times New Roman"/>
+        </w:rPr>
+        <w:t xml:space="preserve"> FAQ</w:t>
+      </w:r>
+      <w:r>
+        <w:rPr>
+          <w:rFonts w:ascii="Times New Roman" w:hAnsi="Times New Roman"/>
+        </w:rPr>
+        <w:t>、售后政策、支付排查手册、运维告警流程、日志指标说明等资料切分为语义片段，然后调用</w:t>
+      </w:r>
+      <w:r>
+        <w:rPr>
+          <w:rFonts w:ascii="Times New Roman" w:hAnsi="Times New Roman"/>
+        </w:rPr>
+        <w:t xml:space="preserve"> Embedding </w:t>
+      </w:r>
+      <w:r>
+        <w:rPr>
+          <w:rFonts w:ascii="Times New Roman" w:hAnsi="Times New Roman"/>
+        </w:rPr>
+        <w:t>模型生成向量并写入</w:t>
+      </w:r>
+      <w:r>
+        <w:rPr>
+          <w:rFonts w:ascii="Times New Roman" w:hAnsi="Times New Roman"/>
+        </w:rPr>
+        <w:t xml:space="preserve"> Milvus</w:t>
+      </w:r>
+      <w:r>
+        <w:rPr>
+          <w:rFonts w:ascii="Times New Roman" w:hAnsi="Times New Roman"/>
+        </w:rPr>
+        <w:t>。用户提问时，系统将问题同样向量化，在</w:t>
+      </w:r>
+      <w:r>
+        <w:rPr>
+          <w:rFonts w:ascii="Times New Roman" w:hAnsi="Times New Roman"/>
+        </w:rPr>
+        <w:t xml:space="preserve"> Milvus </w:t>
+      </w:r>
+      <w:r>
+        <w:rPr>
+          <w:rFonts w:ascii="Times New Roman" w:hAnsi="Times New Roman"/>
+        </w:rPr>
+        <w:t>中按相似度召回</w:t>
+      </w:r>
+      <w:r>
+        <w:rPr>
+          <w:rFonts w:ascii="Times New Roman" w:hAnsi="Times New Roman"/>
+        </w:rPr>
+        <w:t xml:space="preserve"> TopK </w:t>
+      </w:r>
+      <w:r>
+        <w:rPr>
+          <w:rFonts w:ascii="Times New Roman" w:hAnsi="Times New Roman"/>
+        </w:rPr>
+        <w:t>片段，再把片段内容、来源信息和用户问题拼接为模型上下文，使回答受到检索事实约束。</w:t>
+      </w:r>
+    </w:p>
+    <w:p>
+      <w:pPr>
         <w:spacing w:before="120" w:after="80" w:line="240" w:lineRule="auto"/>
         <w:jc w:val="center"/>
         <w:rPr>
@@ -5327,7 +6226,7 @@
           <w:noProof/>
         </w:rPr>
         <w:drawing>
-          <wp:inline distT="0" distB="0" distL="0" distR="0" wp14:anchorId="7FC270C7" wp14:editId="616D8F62">
+          <wp:inline distT="0" distB="0" distL="0" distR="0" wp14:anchorId="1031F21D" wp14:editId="6721F197">
             <wp:extent cx="5580000" cy="2720250"/>
             <wp:effectExtent l="0" t="0" r="0" b="0"/>
             <wp:docPr id="3" name="Picture 3"/>
@@ -5408,7 +6307,7 @@
           <w:color w:val="5A5A5A"/>
           <w:sz w:val="18"/>
         </w:rPr>
-        <w:t>资料来源：根据项目</w:t>
+        <w:t>资料来源：作者根据项目</w:t>
       </w:r>
       <w:r>
         <w:rPr>
@@ -5439,6 +6338,7 @@
         <w:rPr>
           <w:rFonts w:ascii="Times New Roman" w:hAnsi="Times New Roman"/>
         </w:rPr>
+        <w:lastRenderedPageBreak/>
         <w:t>该机制解决了两类问题：一是避免把长文档整体塞入模型导致成本高、速度慢；二是避免模型脱离业务资料生成看似合理但无法验证的答案。论文中的测试结果显示，当用户询问</w:t>
       </w:r>
       <w:r>
@@ -5480,16 +6380,18 @@
     </w:p>
     <w:p>
       <w:pPr>
-        <w:pStyle w:val="21"/>
-      </w:pPr>
-      <w:bookmarkStart w:id="10" w:name="_Toc232608892"/>
-      <w:r>
-        <w:t xml:space="preserve">3.2 ReAct </w:t>
-      </w:r>
-      <w:r>
-        <w:t>智能体原理</w:t>
-      </w:r>
-      <w:bookmarkEnd w:id="10"/>
+        <w:ind w:firstLine="482"/>
+        <w:jc w:val="both"/>
+        <w:rPr>
+          <w:rFonts w:hint="eastAsia"/>
+        </w:rPr>
+      </w:pPr>
+      <w:r>
+        <w:rPr>
+          <w:rFonts w:ascii="Times New Roman" w:hAnsi="Times New Roman"/>
+        </w:rPr>
+        <w:t>文档分片质量直接影响召回效果。若片段过短，单个片段缺少完整语义，模型虽然能命中关键词，却无法获得处理步骤和上下文；若片段过长，向量表示会混合多个主题，导致相似度计算不够精确。系统在实现中综合考虑标题、段落和长度，把常见问题、处理步骤、日志字段说明和注意事项尽量保留在同一语义片段内。对于售后政策和支付排查手册，片段通常围绕一个业务问题组织；对于日志指标说明，片段则围绕字段含义、异常模式和排查关键词组织。</w:t>
+      </w:r>
     </w:p>
     <w:p>
       <w:pPr>
@@ -5503,17 +6405,162 @@
         <w:rPr>
           <w:rFonts w:ascii="Times New Roman" w:hAnsi="Times New Roman"/>
         </w:rPr>
-        <w:t xml:space="preserve">ReAct </w:t>
-      </w:r>
-      <w:r>
-        <w:rPr>
-          <w:rFonts w:ascii="Times New Roman" w:hAnsi="Times New Roman"/>
-        </w:rPr>
-        <w:t>将模型推理和工具调用结合起来。模型接收用户问题后，先判断是否需要调用知识库或外部工具；如果需要，则生成工具调用请求，系统执行工具并返回观察结果；模型再基于观察结果继续推理，直到形成最终答案。该模式适合处理运维场景中的复杂问题，因为排查过程常常需要多轮信息收集和判断。</w:t>
+        <w:t xml:space="preserve">Embedding </w:t>
+      </w:r>
+      <w:r>
+        <w:rPr>
+          <w:rFonts w:ascii="Times New Roman" w:hAnsi="Times New Roman"/>
+        </w:rPr>
+        <w:t>阶段负责把文本转化为向量。向量并不直接用于展示，而是作为语义相似度计算的中间表示。用户问题进入系统后，也会被转化为同一维度的向量，然后与</w:t>
+      </w:r>
+      <w:r>
+        <w:rPr>
+          <w:rFonts w:ascii="Times New Roman" w:hAnsi="Times New Roman"/>
+        </w:rPr>
+        <w:t xml:space="preserve"> Milvus </w:t>
+      </w:r>
+      <w:r>
+        <w:rPr>
+          <w:rFonts w:ascii="Times New Roman" w:hAnsi="Times New Roman"/>
+        </w:rPr>
+        <w:t>中已存储的文档片段向量进行相似度匹配。由于用户提问可能包含口语化表达，例如</w:t>
+      </w:r>
+      <w:r>
+        <w:rPr>
+          <w:rFonts w:ascii="Times New Roman" w:hAnsi="Times New Roman"/>
+        </w:rPr>
+        <w:t>“</w:t>
+      </w:r>
+      <w:r>
+        <w:rPr>
+          <w:rFonts w:ascii="Times New Roman" w:hAnsi="Times New Roman"/>
+        </w:rPr>
+        <w:t>订单卡住了</w:t>
+      </w:r>
+      <w:r>
+        <w:rPr>
+          <w:rFonts w:ascii="Times New Roman" w:hAnsi="Times New Roman"/>
+        </w:rPr>
+        <w:t>”“</w:t>
+      </w:r>
+      <w:r>
+        <w:rPr>
+          <w:rFonts w:ascii="Times New Roman" w:hAnsi="Times New Roman"/>
+        </w:rPr>
+        <w:t>客户说扣款了但是没单</w:t>
+      </w:r>
+      <w:r>
+        <w:rPr>
+          <w:rFonts w:ascii="Times New Roman" w:hAnsi="Times New Roman"/>
+        </w:rPr>
+        <w:t>”</w:t>
+      </w:r>
+      <w:r>
+        <w:rPr>
+          <w:rFonts w:ascii="Times New Roman" w:hAnsi="Times New Roman"/>
+        </w:rPr>
+        <w:t>，向量检索比简单关键词匹配更有优势，能够找到</w:t>
+      </w:r>
+      <w:r>
+        <w:rPr>
+          <w:rFonts w:ascii="Times New Roman" w:hAnsi="Times New Roman"/>
+        </w:rPr>
+        <w:t>“</w:t>
+      </w:r>
+      <w:r>
+        <w:rPr>
+          <w:rFonts w:ascii="Times New Roman" w:hAnsi="Times New Roman"/>
+        </w:rPr>
+        <w:t>支付成功但订单未生成</w:t>
+      </w:r>
+      <w:r>
+        <w:rPr>
+          <w:rFonts w:ascii="Times New Roman" w:hAnsi="Times New Roman"/>
+        </w:rPr>
+        <w:t>”“</w:t>
+      </w:r>
+      <w:r>
+        <w:rPr>
+          <w:rFonts w:ascii="Times New Roman" w:hAnsi="Times New Roman"/>
+        </w:rPr>
+        <w:t>支付回调延迟</w:t>
+      </w:r>
+      <w:r>
+        <w:rPr>
+          <w:rFonts w:ascii="Times New Roman" w:hAnsi="Times New Roman"/>
+        </w:rPr>
+        <w:t>”“</w:t>
+      </w:r>
+      <w:r>
+        <w:rPr>
+          <w:rFonts w:ascii="Times New Roman" w:hAnsi="Times New Roman"/>
+        </w:rPr>
+        <w:t>消息队列堆积</w:t>
+      </w:r>
+      <w:r>
+        <w:rPr>
+          <w:rFonts w:ascii="Times New Roman" w:hAnsi="Times New Roman"/>
+        </w:rPr>
+        <w:t>”</w:t>
+      </w:r>
+      <w:r>
+        <w:rPr>
+          <w:rFonts w:ascii="Times New Roman" w:hAnsi="Times New Roman"/>
+        </w:rPr>
+        <w:t>等语义相关内容。</w:t>
       </w:r>
     </w:p>
     <w:p>
       <w:pPr>
+        <w:ind w:firstLine="482"/>
+        <w:jc w:val="both"/>
+        <w:rPr>
+          <w:rFonts w:hint="eastAsia"/>
+        </w:rPr>
+      </w:pPr>
+      <w:r>
+        <w:rPr>
+          <w:rFonts w:ascii="Times New Roman" w:hAnsi="Times New Roman"/>
+        </w:rPr>
+        <w:t>生成阶段并不是把召回片段简单拼接给用户，而是把片段、问题、历史对话和系统约束一起组织为模型上下文。模型需要根据资料给出结论、排查步骤、需要收集的信息以及风险提醒。为了提高可读性，回答通常采用先结论后步骤的结构：先说明问题可能属于哪类场景，再按优先级列出排查路径，最后提醒用户保留流水、错误码、日志时间范围等证据。</w:t>
+      </w:r>
+    </w:p>
+    <w:p>
+      <w:pPr>
+        <w:pStyle w:val="21"/>
+      </w:pPr>
+      <w:bookmarkStart w:id="12" w:name="_Toc232619453"/>
+      <w:r>
+        <w:t xml:space="preserve">3.2 ReAct </w:t>
+      </w:r>
+      <w:r>
+        <w:t>智能体原理</w:t>
+      </w:r>
+      <w:bookmarkEnd w:id="12"/>
+    </w:p>
+    <w:p>
+      <w:pPr>
+        <w:ind w:firstLine="482"/>
+        <w:jc w:val="both"/>
+        <w:rPr>
+          <w:rFonts w:hint="eastAsia"/>
+        </w:rPr>
+      </w:pPr>
+      <w:r>
+        <w:rPr>
+          <w:rFonts w:ascii="Times New Roman" w:hAnsi="Times New Roman"/>
+        </w:rPr>
+        <w:t xml:space="preserve">ReAct </w:t>
+      </w:r>
+      <w:r>
+        <w:rPr>
+          <w:rFonts w:ascii="Times New Roman" w:hAnsi="Times New Roman"/>
+        </w:rPr>
+        <w:t>将模型推理和工具调用结合起来。模型接收用户问题后，先判断是否需要调用知识库或外部工具；如果需要，则生成工具调用请求，系统执行工具并返回观察结果；模型再基于观察结果继续推理，直到形成最终答案。该模式适合处理运维场景中的复杂问题，因为排查过程常常需要多轮信息收集和判断。</w:t>
+      </w:r>
+    </w:p>
+    <w:p>
+      <w:pPr>
         <w:spacing w:before="120" w:after="80" w:line="240" w:lineRule="auto"/>
         <w:jc w:val="center"/>
         <w:rPr>
@@ -5526,7 +6573,7 @@
         </w:rPr>
         <w:lastRenderedPageBreak/>
         <w:drawing>
-          <wp:inline distT="0" distB="0" distL="0" distR="0" wp14:anchorId="43227DA4" wp14:editId="1D3ACAA8">
+          <wp:inline distT="0" distB="0" distL="0" distR="0" wp14:anchorId="1C3E0A65" wp14:editId="132184AF">
             <wp:extent cx="5580000" cy="2859750"/>
             <wp:effectExtent l="0" t="0" r="0" b="0"/>
             <wp:docPr id="4" name="Picture 4"/>
@@ -5644,16 +6691,42 @@
     </w:p>
     <w:p>
       <w:pPr>
-        <w:pStyle w:val="21"/>
-      </w:pPr>
-      <w:bookmarkStart w:id="11" w:name="_Toc232608893"/>
-      <w:r>
-        <w:t xml:space="preserve">3.3 </w:t>
-      </w:r>
-      <w:r>
-        <w:t>多模态与硬件说明</w:t>
-      </w:r>
-      <w:bookmarkEnd w:id="11"/>
+        <w:ind w:firstLine="482"/>
+        <w:jc w:val="both"/>
+        <w:rPr>
+          <w:rFonts w:hint="eastAsia"/>
+        </w:rPr>
+      </w:pPr>
+      <w:r>
+        <w:rPr>
+          <w:rFonts w:ascii="Times New Roman" w:hAnsi="Times New Roman"/>
+        </w:rPr>
+        <w:t>在本系统中，工具调用并不是为了追求复杂形式，而是为了把大模型不擅长的能力外置。例如，模型无法天然知道当前知识库中有哪些文件，也无法直接访问</w:t>
+      </w:r>
+      <w:r>
+        <w:rPr>
+          <w:rFonts w:ascii="Times New Roman" w:hAnsi="Times New Roman"/>
+        </w:rPr>
+        <w:t xml:space="preserve"> Milvus </w:t>
+      </w:r>
+      <w:r>
+        <w:rPr>
+          <w:rFonts w:ascii="Times New Roman" w:hAnsi="Times New Roman"/>
+        </w:rPr>
+        <w:t>的召回结果，因此需要</w:t>
+      </w:r>
+      <w:r>
+        <w:rPr>
+          <w:rFonts w:ascii="Times New Roman" w:hAnsi="Times New Roman"/>
+        </w:rPr>
+        <w:t xml:space="preserve"> queryInternalDocs </w:t>
+      </w:r>
+      <w:r>
+        <w:rPr>
+          <w:rFonts w:ascii="Times New Roman" w:hAnsi="Times New Roman"/>
+        </w:rPr>
+        <w:t>工具完成检索；模型无法凭空读取系统日志和指标，因此需要日志工具和指标工具返回结构化观察结果。工具描述越清晰，模型越容易在合适时机调用正确工具。</w:t>
+      </w:r>
     </w:p>
     <w:p>
       <w:pPr>
@@ -5667,188 +6740,25 @@
         <w:rPr>
           <w:rFonts w:ascii="Times New Roman" w:hAnsi="Times New Roman"/>
         </w:rPr>
-        <w:t>本作品是云端软件系统，不涉及实体硬件电路，因此</w:t>
-      </w:r>
-      <w:r>
-        <w:rPr>
-          <w:rFonts w:ascii="Times New Roman" w:hAnsi="Times New Roman"/>
-        </w:rPr>
-        <w:t>“</w:t>
-      </w:r>
-      <w:r>
-        <w:rPr>
-          <w:rFonts w:ascii="Times New Roman" w:hAnsi="Times New Roman"/>
-        </w:rPr>
-        <w:t>硬件电路图</w:t>
-      </w:r>
-      <w:r>
-        <w:rPr>
-          <w:rFonts w:ascii="Times New Roman" w:hAnsi="Times New Roman"/>
-        </w:rPr>
-        <w:t>”</w:t>
-      </w:r>
-      <w:r>
-        <w:rPr>
-          <w:rFonts w:ascii="Times New Roman" w:hAnsi="Times New Roman"/>
-        </w:rPr>
-        <w:t>部分以系统部署拓扑和接口链路代替。实际运行中，客户端通过浏览器或</w:t>
-      </w:r>
-      <w:r>
-        <w:rPr>
-          <w:rFonts w:ascii="Times New Roman" w:hAnsi="Times New Roman"/>
-        </w:rPr>
-        <w:t xml:space="preserve"> HTTP </w:t>
-      </w:r>
-      <w:r>
-        <w:rPr>
-          <w:rFonts w:ascii="Times New Roman" w:hAnsi="Times New Roman"/>
-        </w:rPr>
-        <w:t>客户端访问云服务器，服务器侧运行</w:t>
-      </w:r>
-      <w:r>
-        <w:rPr>
-          <w:rFonts w:ascii="Times New Roman" w:hAnsi="Times New Roman"/>
-        </w:rPr>
-        <w:t xml:space="preserve"> Nginx</w:t>
-      </w:r>
-      <w:r>
-        <w:rPr>
-          <w:rFonts w:ascii="Times New Roman" w:hAnsi="Times New Roman"/>
-        </w:rPr>
-        <w:t>、</w:t>
-      </w:r>
-      <w:r>
-        <w:rPr>
-          <w:rFonts w:ascii="Times New Roman" w:hAnsi="Times New Roman"/>
-        </w:rPr>
-        <w:t>Spring Boot</w:t>
-      </w:r>
-      <w:r>
-        <w:rPr>
-          <w:rFonts w:ascii="Times New Roman" w:hAnsi="Times New Roman"/>
-        </w:rPr>
-        <w:t>、</w:t>
-      </w:r>
-      <w:r>
-        <w:rPr>
-          <w:rFonts w:ascii="Times New Roman" w:hAnsi="Times New Roman"/>
-        </w:rPr>
-        <w:t>Milvus</w:t>
-      </w:r>
-      <w:r>
-        <w:rPr>
-          <w:rFonts w:ascii="Times New Roman" w:hAnsi="Times New Roman"/>
-        </w:rPr>
-        <w:t>、</w:t>
-      </w:r>
-      <w:r>
-        <w:rPr>
-          <w:rFonts w:ascii="Times New Roman" w:hAnsi="Times New Roman"/>
-        </w:rPr>
-        <w:t xml:space="preserve">Etcd </w:t>
-      </w:r>
-      <w:r>
-        <w:rPr>
-          <w:rFonts w:ascii="Times New Roman" w:hAnsi="Times New Roman"/>
-        </w:rPr>
-        <w:t>和</w:t>
-      </w:r>
-      <w:r>
-        <w:rPr>
-          <w:rFonts w:ascii="Times New Roman" w:hAnsi="Times New Roman"/>
-        </w:rPr>
-        <w:t xml:space="preserve"> MinIO</w:t>
-      </w:r>
-      <w:r>
-        <w:rPr>
-          <w:rFonts w:ascii="Times New Roman" w:hAnsi="Times New Roman"/>
-        </w:rPr>
-        <w:t>。对于图片输入，</w:t>
-      </w:r>
-      <w:r>
-        <w:rPr>
-          <w:rFonts w:ascii="Times New Roman" w:hAnsi="Times New Roman"/>
-        </w:rPr>
-        <w:t xml:space="preserve">/chat </w:t>
-      </w:r>
-      <w:r>
-        <w:rPr>
-          <w:rFonts w:ascii="Times New Roman" w:hAnsi="Times New Roman"/>
-        </w:rPr>
-        <w:t>接口支持</w:t>
-      </w:r>
-      <w:r>
-        <w:rPr>
-          <w:rFonts w:ascii="Times New Roman" w:hAnsi="Times New Roman"/>
-        </w:rPr>
-        <w:t xml:space="preserve"> images </w:t>
-      </w:r>
-      <w:r>
-        <w:rPr>
-          <w:rFonts w:ascii="Times New Roman" w:hAnsi="Times New Roman"/>
-        </w:rPr>
-        <w:t>字段，系统先调用视觉模型提取告警截图、日志截图或支付凭证中的关键信息，再把观察结果与用户问题合并交给</w:t>
-      </w:r>
-      <w:r>
-        <w:rPr>
-          <w:rFonts w:ascii="Times New Roman" w:hAnsi="Times New Roman"/>
-        </w:rPr>
-        <w:t xml:space="preserve"> Agent</w:t>
-      </w:r>
-      <w:r>
-        <w:rPr>
-          <w:rFonts w:ascii="Times New Roman" w:hAnsi="Times New Roman"/>
-        </w:rPr>
-        <w:t>。</w:t>
+        <w:t xml:space="preserve">ReAct </w:t>
+      </w:r>
+      <w:r>
+        <w:rPr>
+          <w:rFonts w:ascii="Times New Roman" w:hAnsi="Times New Roman"/>
+        </w:rPr>
+        <w:t>流程的另一个价值是让回答过程更接近人工排查。人工处理告警时不会直接给出最终结论，而是先判断告警类型，再查日志、看指标、对照手册，最后汇总根因和建议。智能体也采用类似闭环：先根据问题判断是否需要知识库或工具，随后执行查询并观察结果，再决定继续追问、继续调用工具或输出结论。该过程使系统具备处理多步骤问题的基础能力。</w:t>
       </w:r>
     </w:p>
     <w:p>
       <w:pPr>
-        <w:ind w:firstLine="482"/>
-        <w:jc w:val="both"/>
-        <w:rPr>
-          <w:rFonts w:hint="eastAsia"/>
-        </w:rPr>
-      </w:pPr>
-      <w:r>
-        <w:rPr>
-          <w:rFonts w:ascii="Times New Roman" w:hAnsi="Times New Roman"/>
-        </w:rPr>
-        <w:t>这种设计为后续接入真实监控截图、工单截图或客服聊天截图提供了扩展路径。在安全边界上，当前系统只输出建议和操作清单，不直接执行自动退款、自动扩容、删除资源等生产变更。</w:t>
-      </w:r>
-    </w:p>
-    <w:p>
-      <w:pPr>
-        <w:pStyle w:val="1"/>
-      </w:pPr>
-      <w:bookmarkStart w:id="12" w:name="_Toc232608894"/>
-      <w:r>
-        <w:t>第</w:t>
-      </w:r>
-      <w:r>
-        <w:t>4</w:t>
-      </w:r>
-      <w:r>
-        <w:t>章</w:t>
-      </w:r>
-      <w:r>
-        <w:t xml:space="preserve"> </w:t>
-      </w:r>
-      <w:r>
-        <w:t>软件设计与流程</w:t>
-      </w:r>
-      <w:bookmarkEnd w:id="12"/>
-    </w:p>
-    <w:p>
-      <w:pPr>
         <w:pStyle w:val="21"/>
       </w:pPr>
-      <w:bookmarkStart w:id="13" w:name="_Toc232608895"/>
-      <w:r>
-        <w:t xml:space="preserve">4.1 </w:t>
-      </w:r>
-      <w:r>
-        <w:t>后端接口设计</w:t>
+      <w:bookmarkStart w:id="13" w:name="_Toc232619454"/>
+      <w:r>
+        <w:t xml:space="preserve">3.3 Prompt </w:t>
+      </w:r>
+      <w:r>
+        <w:t>组织与上下文控制</w:t>
       </w:r>
       <w:bookmarkEnd w:id="13"/>
     </w:p>
@@ -5864,6 +6774,337 @@
         <w:rPr>
           <w:rFonts w:ascii="Times New Roman" w:hAnsi="Times New Roman"/>
         </w:rPr>
+        <w:t xml:space="preserve">Prompt </w:t>
+      </w:r>
+      <w:r>
+        <w:rPr>
+          <w:rFonts w:ascii="Times New Roman" w:hAnsi="Times New Roman"/>
+        </w:rPr>
+        <w:t>是连接检索结果、工具结果和模型回答的重要环节。系统需要在</w:t>
+      </w:r>
+      <w:r>
+        <w:rPr>
+          <w:rFonts w:ascii="Times New Roman" w:hAnsi="Times New Roman"/>
+        </w:rPr>
+        <w:t xml:space="preserve"> Prompt </w:t>
+      </w:r>
+      <w:r>
+        <w:rPr>
+          <w:rFonts w:ascii="Times New Roman" w:hAnsi="Times New Roman"/>
+        </w:rPr>
+        <w:t>中明确三类信息：第一类是用户原始问题和历史上下文，用于判断当前问题是否是追问；第二类是知识库召回片段，用于提供事实依据；第三类是回答约束，用于要求模型保持专业、说明依据、避免直接执行高风险操作。若</w:t>
+      </w:r>
+      <w:r>
+        <w:rPr>
+          <w:rFonts w:ascii="Times New Roman" w:hAnsi="Times New Roman"/>
+        </w:rPr>
+        <w:t xml:space="preserve"> Prompt </w:t>
+      </w:r>
+      <w:r>
+        <w:rPr>
+          <w:rFonts w:ascii="Times New Roman" w:hAnsi="Times New Roman"/>
+        </w:rPr>
+        <w:t>只包含用户问题，模型容易给出泛化答案；若只包含检索片段而缺少任务约束，模型可能复述文档而不是生成可执行建议。</w:t>
+      </w:r>
+    </w:p>
+    <w:p>
+      <w:pPr>
+        <w:ind w:firstLine="482"/>
+        <w:jc w:val="both"/>
+        <w:rPr>
+          <w:rFonts w:hint="eastAsia"/>
+        </w:rPr>
+      </w:pPr>
+      <w:r>
+        <w:rPr>
+          <w:rFonts w:ascii="Times New Roman" w:hAnsi="Times New Roman"/>
+        </w:rPr>
+        <w:lastRenderedPageBreak/>
+        <w:t>上下文控制还体现在多轮会话中。用户在第一次提问后，可能继续追问</w:t>
+      </w:r>
+      <w:r>
+        <w:rPr>
+          <w:rFonts w:ascii="Times New Roman" w:hAnsi="Times New Roman"/>
+        </w:rPr>
+        <w:t>“</w:t>
+      </w:r>
+      <w:r>
+        <w:rPr>
+          <w:rFonts w:ascii="Times New Roman" w:hAnsi="Times New Roman"/>
+        </w:rPr>
+        <w:t>那客户现在应该怎么回复</w:t>
+      </w:r>
+      <w:r>
+        <w:rPr>
+          <w:rFonts w:ascii="Times New Roman" w:hAnsi="Times New Roman"/>
+        </w:rPr>
+        <w:t>”“</w:t>
+      </w:r>
+      <w:r>
+        <w:rPr>
+          <w:rFonts w:ascii="Times New Roman" w:hAnsi="Times New Roman"/>
+        </w:rPr>
+        <w:t>如果已经扣款怎么办</w:t>
+      </w:r>
+      <w:r>
+        <w:rPr>
+          <w:rFonts w:ascii="Times New Roman" w:hAnsi="Times New Roman"/>
+        </w:rPr>
+        <w:t>”“</w:t>
+      </w:r>
+      <w:r>
+        <w:rPr>
+          <w:rFonts w:ascii="Times New Roman" w:hAnsi="Times New Roman"/>
+        </w:rPr>
+        <w:t>是否需要升级工单</w:t>
+      </w:r>
+      <w:r>
+        <w:rPr>
+          <w:rFonts w:ascii="Times New Roman" w:hAnsi="Times New Roman"/>
+        </w:rPr>
+        <w:t>”</w:t>
+      </w:r>
+      <w:r>
+        <w:rPr>
+          <w:rFonts w:ascii="Times New Roman" w:hAnsi="Times New Roman"/>
+        </w:rPr>
+        <w:t>等问题。系统通过</w:t>
+      </w:r>
+      <w:r>
+        <w:rPr>
+          <w:rFonts w:ascii="Times New Roman" w:hAnsi="Times New Roman"/>
+        </w:rPr>
+        <w:t xml:space="preserve"> session_id </w:t>
+      </w:r>
+      <w:r>
+        <w:rPr>
+          <w:rFonts w:ascii="Times New Roman" w:hAnsi="Times New Roman"/>
+        </w:rPr>
+        <w:t>保存会话上下文，使后续问题能够继承前一次的业务场景。这样既减少重复输入，也让智能体能够围绕同一事件逐步补充建议。</w:t>
+      </w:r>
+    </w:p>
+    <w:p>
+      <w:pPr>
+        <w:pStyle w:val="21"/>
+      </w:pPr>
+      <w:bookmarkStart w:id="14" w:name="_Toc232619455"/>
+      <w:r>
+        <w:t xml:space="preserve">3.4 </w:t>
+      </w:r>
+      <w:r>
+        <w:t>多模态与硬件说明</w:t>
+      </w:r>
+      <w:bookmarkEnd w:id="14"/>
+    </w:p>
+    <w:p>
+      <w:pPr>
+        <w:ind w:firstLine="482"/>
+        <w:jc w:val="both"/>
+        <w:rPr>
+          <w:rFonts w:hint="eastAsia"/>
+        </w:rPr>
+      </w:pPr>
+      <w:r>
+        <w:rPr>
+          <w:rFonts w:ascii="Times New Roman" w:hAnsi="Times New Roman"/>
+        </w:rPr>
+        <w:t>本作品是云端软件系统，不涉及实体硬件电路，因此</w:t>
+      </w:r>
+      <w:r>
+        <w:rPr>
+          <w:rFonts w:ascii="Times New Roman" w:hAnsi="Times New Roman"/>
+        </w:rPr>
+        <w:t>“</w:t>
+      </w:r>
+      <w:r>
+        <w:rPr>
+          <w:rFonts w:ascii="Times New Roman" w:hAnsi="Times New Roman"/>
+        </w:rPr>
+        <w:t>硬件电路图</w:t>
+      </w:r>
+      <w:r>
+        <w:rPr>
+          <w:rFonts w:ascii="Times New Roman" w:hAnsi="Times New Roman"/>
+        </w:rPr>
+        <w:t>”</w:t>
+      </w:r>
+      <w:r>
+        <w:rPr>
+          <w:rFonts w:ascii="Times New Roman" w:hAnsi="Times New Roman"/>
+        </w:rPr>
+        <w:t>部分以系统部署拓扑和接口链路代替。实际运行中，客户端通过浏览器或</w:t>
+      </w:r>
+      <w:r>
+        <w:rPr>
+          <w:rFonts w:ascii="Times New Roman" w:hAnsi="Times New Roman"/>
+        </w:rPr>
+        <w:t xml:space="preserve"> HTTP </w:t>
+      </w:r>
+      <w:r>
+        <w:rPr>
+          <w:rFonts w:ascii="Times New Roman" w:hAnsi="Times New Roman"/>
+        </w:rPr>
+        <w:t>客户端访问云服务器，服务器侧运行</w:t>
+      </w:r>
+      <w:r>
+        <w:rPr>
+          <w:rFonts w:ascii="Times New Roman" w:hAnsi="Times New Roman"/>
+        </w:rPr>
+        <w:t xml:space="preserve"> Nginx</w:t>
+      </w:r>
+      <w:r>
+        <w:rPr>
+          <w:rFonts w:ascii="Times New Roman" w:hAnsi="Times New Roman"/>
+        </w:rPr>
+        <w:t>、</w:t>
+      </w:r>
+      <w:r>
+        <w:rPr>
+          <w:rFonts w:ascii="Times New Roman" w:hAnsi="Times New Roman"/>
+        </w:rPr>
+        <w:t>Spring Boot</w:t>
+      </w:r>
+      <w:r>
+        <w:rPr>
+          <w:rFonts w:ascii="Times New Roman" w:hAnsi="Times New Roman"/>
+        </w:rPr>
+        <w:t>、</w:t>
+      </w:r>
+      <w:r>
+        <w:rPr>
+          <w:rFonts w:ascii="Times New Roman" w:hAnsi="Times New Roman"/>
+        </w:rPr>
+        <w:t>Milvus</w:t>
+      </w:r>
+      <w:r>
+        <w:rPr>
+          <w:rFonts w:ascii="Times New Roman" w:hAnsi="Times New Roman"/>
+        </w:rPr>
+        <w:t>、</w:t>
+      </w:r>
+      <w:r>
+        <w:rPr>
+          <w:rFonts w:ascii="Times New Roman" w:hAnsi="Times New Roman"/>
+        </w:rPr>
+        <w:t xml:space="preserve">Etcd </w:t>
+      </w:r>
+      <w:r>
+        <w:rPr>
+          <w:rFonts w:ascii="Times New Roman" w:hAnsi="Times New Roman"/>
+        </w:rPr>
+        <w:t>和</w:t>
+      </w:r>
+      <w:r>
+        <w:rPr>
+          <w:rFonts w:ascii="Times New Roman" w:hAnsi="Times New Roman"/>
+        </w:rPr>
+        <w:t xml:space="preserve"> MinIO</w:t>
+      </w:r>
+      <w:r>
+        <w:rPr>
+          <w:rFonts w:ascii="Times New Roman" w:hAnsi="Times New Roman"/>
+        </w:rPr>
+        <w:t>。对于图片输入，</w:t>
+      </w:r>
+      <w:r>
+        <w:rPr>
+          <w:rFonts w:ascii="Times New Roman" w:hAnsi="Times New Roman"/>
+        </w:rPr>
+        <w:t xml:space="preserve">/chat </w:t>
+      </w:r>
+      <w:r>
+        <w:rPr>
+          <w:rFonts w:ascii="Times New Roman" w:hAnsi="Times New Roman"/>
+        </w:rPr>
+        <w:t>接口支持</w:t>
+      </w:r>
+      <w:r>
+        <w:rPr>
+          <w:rFonts w:ascii="Times New Roman" w:hAnsi="Times New Roman"/>
+        </w:rPr>
+        <w:t xml:space="preserve"> images </w:t>
+      </w:r>
+      <w:r>
+        <w:rPr>
+          <w:rFonts w:ascii="Times New Roman" w:hAnsi="Times New Roman"/>
+        </w:rPr>
+        <w:t>字段，系统先调用视觉模型提取告警截图、日志截图或支付凭证中的关键信息，再把观察结果与用户问题合并交给</w:t>
+      </w:r>
+      <w:r>
+        <w:rPr>
+          <w:rFonts w:ascii="Times New Roman" w:hAnsi="Times New Roman"/>
+        </w:rPr>
+        <w:t xml:space="preserve"> Agent</w:t>
+      </w:r>
+      <w:r>
+        <w:rPr>
+          <w:rFonts w:ascii="Times New Roman" w:hAnsi="Times New Roman"/>
+        </w:rPr>
+        <w:t>。</w:t>
+      </w:r>
+    </w:p>
+    <w:p>
+      <w:pPr>
+        <w:ind w:firstLine="482"/>
+        <w:jc w:val="both"/>
+        <w:rPr>
+          <w:rFonts w:hint="eastAsia"/>
+        </w:rPr>
+      </w:pPr>
+      <w:r>
+        <w:rPr>
+          <w:rFonts w:ascii="Times New Roman" w:hAnsi="Times New Roman"/>
+        </w:rPr>
+        <w:t>这种设计为后续接入真实监控截图、工单截图或客服聊天截图提供了扩展路径。在安全边界上，当前系统只输出建议和操作清单，不直接执行自动退款、自动扩容、删除资源等生产变更。</w:t>
+      </w:r>
+    </w:p>
+    <w:p>
+      <w:pPr>
+        <w:pStyle w:val="1"/>
+      </w:pPr>
+      <w:bookmarkStart w:id="15" w:name="_Toc232619456"/>
+      <w:r>
+        <w:t>第</w:t>
+      </w:r>
+      <w:r>
+        <w:t>4</w:t>
+      </w:r>
+      <w:r>
+        <w:t>章</w:t>
+      </w:r>
+      <w:r>
+        <w:t xml:space="preserve"> </w:t>
+      </w:r>
+      <w:r>
+        <w:t>软件设计与流程</w:t>
+      </w:r>
+      <w:bookmarkEnd w:id="15"/>
+    </w:p>
+    <w:p>
+      <w:pPr>
+        <w:pStyle w:val="21"/>
+      </w:pPr>
+      <w:bookmarkStart w:id="16" w:name="_Toc232619457"/>
+      <w:r>
+        <w:t xml:space="preserve">4.1 </w:t>
+      </w:r>
+      <w:r>
+        <w:t>后端接口设计</w:t>
+      </w:r>
+      <w:bookmarkEnd w:id="16"/>
+    </w:p>
+    <w:p>
+      <w:pPr>
+        <w:ind w:firstLine="482"/>
+        <w:jc w:val="both"/>
+        <w:rPr>
+          <w:rFonts w:hint="eastAsia"/>
+        </w:rPr>
+      </w:pPr>
+      <w:r>
+        <w:rPr>
+          <w:rFonts w:ascii="Times New Roman" w:hAnsi="Times New Roman"/>
+        </w:rPr>
         <w:t>后端围绕标准问答、知识库管理和调试验证三类接口展开。</w:t>
       </w:r>
       <w:r>
@@ -5876,7 +7117,19 @@
         <w:rPr>
           <w:rFonts w:ascii="Times New Roman" w:hAnsi="Times New Roman"/>
         </w:rPr>
-        <w:t>是比赛和外部系统的统一入口，接收</w:t>
+        <w:t>是</w:t>
+      </w:r>
+      <w:r>
+        <w:rPr>
+          <w:rFonts w:ascii="Times New Roman" w:hAnsi="Times New Roman"/>
+        </w:rPr>
+        <w:t xml:space="preserve"> Web </w:t>
+      </w:r>
+      <w:r>
+        <w:rPr>
+          <w:rFonts w:ascii="Times New Roman" w:hAnsi="Times New Roman"/>
+        </w:rPr>
+        <w:t>前端和外部系统的统一问答入口，接收</w:t>
       </w:r>
       <w:r>
         <w:rPr>
@@ -5960,14 +7213,7 @@
         <w:rPr>
           <w:rFonts w:ascii="Times New Roman" w:hAnsi="Times New Roman"/>
         </w:rPr>
-        <w:t>用于查看已</w:t>
-      </w:r>
-      <w:r>
-        <w:rPr>
-          <w:rFonts w:ascii="Times New Roman" w:hAnsi="Times New Roman"/>
-        </w:rPr>
-        <w:lastRenderedPageBreak/>
-        <w:t>上传文件，</w:t>
+        <w:t>用于查看已上传文件，</w:t>
       </w:r>
       <w:r>
         <w:rPr>
@@ -5992,6 +7238,33 @@
           <w:rFonts w:ascii="Times New Roman" w:hAnsi="Times New Roman"/>
         </w:rPr>
         <w:t>用于检查向量库连接状态。</w:t>
+      </w:r>
+    </w:p>
+    <w:p>
+      <w:pPr>
+        <w:ind w:firstLine="482"/>
+        <w:jc w:val="both"/>
+        <w:rPr>
+          <w:rFonts w:hint="eastAsia"/>
+        </w:rPr>
+      </w:pPr>
+      <w:r>
+        <w:rPr>
+          <w:rFonts w:ascii="Times New Roman" w:hAnsi="Times New Roman"/>
+        </w:rPr>
+        <w:t>接口返回结构尽量保持稳定，便于前端和外部系统集成。问答接口在成功时返回统一状态码、提示信息、回答内容和会话标识；在鉴权失败时返回</w:t>
+      </w:r>
+      <w:r>
+        <w:rPr>
+          <w:rFonts w:ascii="Times New Roman" w:hAnsi="Times New Roman"/>
+        </w:rPr>
+        <w:t xml:space="preserve"> 401</w:t>
+      </w:r>
+      <w:r>
+        <w:rPr>
+          <w:rFonts w:ascii="Times New Roman" w:hAnsi="Times New Roman"/>
+        </w:rPr>
+        <w:t>，避免未授权访问消耗模型资源；在知识库或模型调用异常时，后端应返回明确错误信息，便于定位是配置问题、向量库连接问题还是上游模型服务问题。这样的接口设计可以降低调试成本，也为后续接入更多客户端保留空间。</w:t>
       </w:r>
     </w:p>
     <w:p>
@@ -6224,7 +7497,15 @@
                 <w:rFonts w:ascii="Times New Roman" w:hAnsi="Times New Roman"/>
                 <w:sz w:val="21"/>
               </w:rPr>
-              <w:t xml:space="preserve"> session_id</w:t>
+              <w:t xml:space="preserve"> </w:t>
+            </w:r>
+            <w:r>
+              <w:rPr>
+                <w:rFonts w:ascii="Times New Roman" w:hAnsi="Times New Roman"/>
+                <w:sz w:val="21"/>
+              </w:rPr>
+              <w:lastRenderedPageBreak/>
+              <w:t>session_id</w:t>
             </w:r>
           </w:p>
         </w:tc>
@@ -6250,6 +7531,7 @@
                 <w:rFonts w:ascii="Times New Roman" w:hAnsi="Times New Roman"/>
                 <w:sz w:val="21"/>
               </w:rPr>
+              <w:lastRenderedPageBreak/>
               <w:t>/api/upload</w:t>
             </w:r>
           </w:p>
@@ -6556,21 +7838,21 @@
           <w:color w:val="5A5A5A"/>
           <w:sz w:val="18"/>
         </w:rPr>
-        <w:t>资料来源：项目设计与验证材料整理。</w:t>
+        <w:t>资料来源：作者根据项目设计、代码实现与验证结果整理。</w:t>
       </w:r>
     </w:p>
     <w:p>
       <w:pPr>
         <w:pStyle w:val="21"/>
       </w:pPr>
-      <w:bookmarkStart w:id="14" w:name="_Toc232608896"/>
+      <w:bookmarkStart w:id="17" w:name="_Toc232619458"/>
       <w:r>
         <w:t xml:space="preserve">4.2 </w:t>
       </w:r>
       <w:r>
         <w:t>知识库投喂流程</w:t>
       </w:r>
-      <w:bookmarkEnd w:id="14"/>
+      <w:bookmarkEnd w:id="17"/>
     </w:p>
     <w:p>
       <w:pPr>
@@ -6724,19 +8006,58 @@
     </w:p>
     <w:p>
       <w:pPr>
-        <w:pStyle w:val="21"/>
-      </w:pPr>
-      <w:bookmarkStart w:id="15" w:name="_Toc232608897"/>
-      <w:r>
-        <w:t xml:space="preserve">4.3 </w:t>
-      </w:r>
-      <w:r>
-        <w:t>前端交互设计</w:t>
-      </w:r>
-      <w:bookmarkEnd w:id="15"/>
+        <w:ind w:firstLine="482"/>
+        <w:jc w:val="both"/>
+        <w:rPr>
+          <w:rFonts w:hint="eastAsia"/>
+        </w:rPr>
+      </w:pPr>
+      <w:r>
+        <w:rPr>
+          <w:rFonts w:ascii="Times New Roman" w:hAnsi="Times New Roman"/>
+        </w:rPr>
+        <w:t>知识库投喂流程还需要考虑资料质量。过于口语化、重复或缺少标题的资料会降低召回质量，因此示例知识库按场景进行组织：</w:t>
+      </w:r>
+      <w:r>
+        <w:rPr>
+          <w:rFonts w:ascii="Times New Roman" w:hAnsi="Times New Roman"/>
+        </w:rPr>
+        <w:t xml:space="preserve">FAQ </w:t>
+      </w:r>
+      <w:r>
+        <w:rPr>
+          <w:rFonts w:ascii="Times New Roman" w:hAnsi="Times New Roman"/>
+        </w:rPr>
+        <w:t>资料强调用户问题和标准答复，售后资料强调优先级、</w:t>
+      </w:r>
+      <w:r>
+        <w:rPr>
+          <w:rFonts w:ascii="Times New Roman" w:hAnsi="Times New Roman"/>
+        </w:rPr>
+        <w:t xml:space="preserve">SLA </w:t>
+      </w:r>
+      <w:r>
+        <w:rPr>
+          <w:rFonts w:ascii="Times New Roman" w:hAnsi="Times New Roman"/>
+        </w:rPr>
+        <w:t>与升级规则，运维资料强调告警现象、可能原因、排查命令和处置建议，日志指标资料强调字段解释和关键词。这样的结构化整理使分片后的内容更适合被向量检索和模型引用。</w:t>
+      </w:r>
     </w:p>
     <w:p>
       <w:pPr>
+        <w:pStyle w:val="21"/>
+      </w:pPr>
+      <w:bookmarkStart w:id="18" w:name="_Toc232619459"/>
+      <w:r>
+        <w:t xml:space="preserve">4.3 </w:t>
+      </w:r>
+      <w:r>
+        <w:t>前端交互设计</w:t>
+      </w:r>
+      <w:bookmarkEnd w:id="18"/>
+    </w:p>
+    <w:p>
+      <w:pPr>
         <w:ind w:firstLine="482"/>
         <w:jc w:val="both"/>
         <w:rPr>
@@ -6759,7 +8080,7 @@
         <w:rPr>
           <w:rFonts w:ascii="Times New Roman" w:hAnsi="Times New Roman"/>
         </w:rPr>
-        <w:t>能力可见，系统在回答后显示引用来源，包含命中文件名、片段标题、片段摘要和相似度。该设计比只展示最终答案更适合比赛答辩，因为评委能够直接观察知识库命中情况。</w:t>
+        <w:t>能力可见，系统在回答后显示引用来源，包含命中文件名、片段标题、片段摘要和相似度。该设计比只展示最终答案更适合技术演示，因为使用者能够直接观察知识库命中情况。</w:t>
       </w:r>
     </w:p>
     <w:p>
@@ -6776,7 +8097,7 @@
         </w:rPr>
         <w:lastRenderedPageBreak/>
         <w:drawing>
-          <wp:inline distT="0" distB="0" distL="0" distR="0" wp14:anchorId="737D4CD8" wp14:editId="28F9F50E">
+          <wp:inline distT="0" distB="0" distL="0" distR="0" wp14:anchorId="07EBE5B3" wp14:editId="7FD7B95F">
             <wp:extent cx="5328000" cy="3386124"/>
             <wp:effectExtent l="0" t="0" r="0" b="0"/>
             <wp:docPr id="5" name="Picture 5"/>
@@ -6873,7 +8194,7 @@
           <w:noProof/>
         </w:rPr>
         <w:drawing>
-          <wp:inline distT="0" distB="0" distL="0" distR="0" wp14:anchorId="183AD3DC" wp14:editId="23DE541F">
+          <wp:inline distT="0" distB="0" distL="0" distR="0" wp14:anchorId="11EF7E4E" wp14:editId="2BCD3581">
             <wp:extent cx="5328000" cy="3386124"/>
             <wp:effectExtent l="0" t="0" r="0" b="0"/>
             <wp:docPr id="6" name="Picture 6"/>
@@ -6961,7 +8282,7 @@
       <w:pPr>
         <w:pStyle w:val="21"/>
       </w:pPr>
-      <w:bookmarkStart w:id="16" w:name="_Toc232608898"/>
+      <w:bookmarkStart w:id="19" w:name="_Toc232619460"/>
       <w:r>
         <w:lastRenderedPageBreak/>
         <w:t xml:space="preserve">4.4 </w:t>
@@ -6969,7 +8290,7 @@
       <w:r>
         <w:t>安全与配置设计</w:t>
       </w:r>
-      <w:bookmarkEnd w:id="16"/>
+      <w:bookmarkEnd w:id="19"/>
     </w:p>
     <w:p>
       <w:pPr>
@@ -7079,7 +8400,7 @@
         <w:rPr>
           <w:rFonts w:ascii="Times New Roman" w:hAnsi="Times New Roman"/>
         </w:rPr>
-        <w:t>。对于比赛演示，可将</w:t>
+        <w:t>。对于公开演示，可将临时</w:t>
       </w:r>
       <w:r>
         <w:rPr>
@@ -7091,43 +8412,173 @@
         <w:rPr>
           <w:rFonts w:ascii="Times New Roman" w:hAnsi="Times New Roman"/>
         </w:rPr>
-        <w:t>单独提供给评审，不在公开材料中展示。</w:t>
+        <w:t>单独提供给测试人员，不在公开材料中展示。</w:t>
       </w:r>
     </w:p>
     <w:p>
       <w:pPr>
-        <w:pStyle w:val="1"/>
-      </w:pPr>
-      <w:bookmarkStart w:id="17" w:name="_Toc232608899"/>
-      <w:r>
-        <w:t>第</w:t>
-      </w:r>
-      <w:r>
-        <w:t>5</w:t>
-      </w:r>
-      <w:r>
-        <w:t>章</w:t>
-      </w:r>
-      <w:r>
-        <w:t xml:space="preserve"> </w:t>
-      </w:r>
-      <w:r>
-        <w:t>系统测试与分析</w:t>
-      </w:r>
-      <w:bookmarkEnd w:id="17"/>
+        <w:ind w:firstLine="482"/>
+        <w:jc w:val="both"/>
+        <w:rPr>
+          <w:rFonts w:hint="eastAsia"/>
+        </w:rPr>
+      </w:pPr>
+      <w:r>
+        <w:rPr>
+          <w:rFonts w:ascii="Times New Roman" w:hAnsi="Times New Roman"/>
+        </w:rPr>
+        <w:t>在权限边界上，当前版本主要保护问答入口和敏感配置，后续还可以进一步细分知识库上传、文件删除、健康检查和调试检索等管理能力。例如，普通用户只允许提问和查看引用来源，管理员才能上传或删除知识库资料；调试接口可限制在内网或管理员账号下使用，避免泄露内部文档片段。这样的权限设计更符合真实企业系统的安全要求。</w:t>
+      </w:r>
     </w:p>
     <w:p>
       <w:pPr>
         <w:pStyle w:val="21"/>
       </w:pPr>
-      <w:bookmarkStart w:id="18" w:name="_Toc232608900"/>
+      <w:bookmarkStart w:id="20" w:name="_Toc232619461"/>
+      <w:r>
+        <w:t xml:space="preserve">4.5 </w:t>
+      </w:r>
+      <w:r>
+        <w:t>异常处理与可维护性设计</w:t>
+      </w:r>
+      <w:bookmarkEnd w:id="20"/>
+    </w:p>
+    <w:p>
+      <w:pPr>
+        <w:ind w:firstLine="482"/>
+        <w:jc w:val="both"/>
+        <w:rPr>
+          <w:rFonts w:hint="eastAsia"/>
+        </w:rPr>
+      </w:pPr>
+      <w:r>
+        <w:rPr>
+          <w:rFonts w:ascii="Times New Roman" w:hAnsi="Times New Roman"/>
+        </w:rPr>
+        <w:t>系统运行过程中可能出现三类异常：模型服务异常、向量数据库异常和资料处理异常。模型服务异常通常与</w:t>
+      </w:r>
+      <w:r>
+        <w:rPr>
+          <w:rFonts w:ascii="Times New Roman" w:hAnsi="Times New Roman"/>
+        </w:rPr>
+        <w:t xml:space="preserve"> API Key</w:t>
+      </w:r>
+      <w:r>
+        <w:rPr>
+          <w:rFonts w:ascii="Times New Roman" w:hAnsi="Times New Roman"/>
+        </w:rPr>
+        <w:t>、网络连接、模型权限或请求格式有关；向量数据库异常可能来自</w:t>
+      </w:r>
+      <w:r>
+        <w:rPr>
+          <w:rFonts w:ascii="Times New Roman" w:hAnsi="Times New Roman"/>
+        </w:rPr>
+        <w:t xml:space="preserve"> Docker </w:t>
+      </w:r>
+      <w:r>
+        <w:rPr>
+          <w:rFonts w:ascii="Times New Roman" w:hAnsi="Times New Roman"/>
+        </w:rPr>
+        <w:t>容器未启动、集合不存在或维度不一致；资料处理异常则可能来自文件编码、空文件、超大文件或不支持的格式。为了便于排查，项目提供了</w:t>
+      </w:r>
+      <w:r>
+        <w:rPr>
+          <w:rFonts w:ascii="Times New Roman" w:hAnsi="Times New Roman"/>
+        </w:rPr>
+        <w:t xml:space="preserve"> /milvus/health</w:t>
+      </w:r>
+      <w:r>
+        <w:rPr>
+          <w:rFonts w:ascii="Times New Roman" w:hAnsi="Times New Roman"/>
+        </w:rPr>
+        <w:t>、</w:t>
+      </w:r>
+      <w:r>
+        <w:rPr>
+          <w:rFonts w:ascii="Times New Roman" w:hAnsi="Times New Roman"/>
+        </w:rPr>
+        <w:t xml:space="preserve">/api/rag/search </w:t>
+      </w:r>
+      <w:r>
+        <w:rPr>
+          <w:rFonts w:ascii="Times New Roman" w:hAnsi="Times New Roman"/>
+        </w:rPr>
+        <w:t>和运行日志，开发者可以先验证向量库，再验证召回，最后验证完整问答链路。</w:t>
+      </w:r>
+    </w:p>
+    <w:p>
+      <w:pPr>
+        <w:ind w:firstLine="482"/>
+        <w:jc w:val="both"/>
+        <w:rPr>
+          <w:rFonts w:hint="eastAsia"/>
+        </w:rPr>
+      </w:pPr>
+      <w:r>
+        <w:rPr>
+          <w:rFonts w:ascii="Times New Roman" w:hAnsi="Times New Roman"/>
+        </w:rPr>
+        <w:t>可维护性方面，项目把部署脚本、运行说明、接口说明和验证报告放在固定目录，便于团队成员复现环境。云端服务由</w:t>
+      </w:r>
+      <w:r>
+        <w:rPr>
+          <w:rFonts w:ascii="Times New Roman" w:hAnsi="Times New Roman"/>
+        </w:rPr>
+        <w:t xml:space="preserve"> systemd </w:t>
+      </w:r>
+      <w:r>
+        <w:rPr>
+          <w:rFonts w:ascii="Times New Roman" w:hAnsi="Times New Roman"/>
+        </w:rPr>
+        <w:t>托管，重启、查看日志和开机自启都可以通过标准命令完成；向量数据库由</w:t>
+      </w:r>
+      <w:r>
+        <w:rPr>
+          <w:rFonts w:ascii="Times New Roman" w:hAnsi="Times New Roman"/>
+        </w:rPr>
+        <w:t xml:space="preserve"> Docker Compose </w:t>
+      </w:r>
+      <w:r>
+        <w:rPr>
+          <w:rFonts w:ascii="Times New Roman" w:hAnsi="Times New Roman"/>
+        </w:rPr>
+        <w:t>管理，便于在本地和服务器之间保持一致。配置项通过环境变量读取，使代码不依赖某一台机器的固定路径或个人密钥。</w:t>
+      </w:r>
+    </w:p>
+    <w:p>
+      <w:pPr>
+        <w:pStyle w:val="1"/>
+      </w:pPr>
+      <w:bookmarkStart w:id="21" w:name="_Toc232619462"/>
+      <w:r>
+        <w:t>第</w:t>
+      </w:r>
+      <w:r>
+        <w:t>5</w:t>
+      </w:r>
+      <w:r>
+        <w:t>章</w:t>
+      </w:r>
+      <w:r>
+        <w:t xml:space="preserve"> </w:t>
+      </w:r>
+      <w:r>
+        <w:t>系统测试与分析</w:t>
+      </w:r>
+      <w:bookmarkEnd w:id="21"/>
+    </w:p>
+    <w:p>
+      <w:pPr>
+        <w:pStyle w:val="21"/>
+      </w:pPr>
+      <w:bookmarkStart w:id="22" w:name="_Toc232619463"/>
       <w:r>
         <w:t xml:space="preserve">5.1 </w:t>
       </w:r>
       <w:r>
         <w:t>测试环境</w:t>
       </w:r>
-      <w:bookmarkEnd w:id="18"/>
+      <w:bookmarkEnd w:id="22"/>
     </w:p>
     <w:p>
       <w:pPr>
@@ -7438,6 +8889,7 @@
                 <w:rFonts w:ascii="Times New Roman" w:hAnsi="Times New Roman"/>
                 <w:sz w:val="21"/>
               </w:rPr>
+              <w:lastRenderedPageBreak/>
               <w:t xml:space="preserve">Java </w:t>
             </w:r>
             <w:r>
@@ -7693,21 +9145,21 @@
           <w:color w:val="5A5A5A"/>
           <w:sz w:val="18"/>
         </w:rPr>
-        <w:t>资料来源：项目设计与验证材料整理。</w:t>
+        <w:t>资料来源：作者根据项目设计、代码实现与验证结果整理。</w:t>
       </w:r>
     </w:p>
     <w:p>
       <w:pPr>
         <w:pStyle w:val="21"/>
       </w:pPr>
-      <w:bookmarkStart w:id="19" w:name="_Toc232608901"/>
+      <w:bookmarkStart w:id="23" w:name="_Toc232619464"/>
       <w:r>
         <w:t xml:space="preserve">5.2 </w:t>
       </w:r>
       <w:r>
         <w:t>功能测试结果</w:t>
       </w:r>
-      <w:bookmarkEnd w:id="19"/>
+      <w:bookmarkEnd w:id="23"/>
     </w:p>
     <w:p>
       <w:pPr>
@@ -8432,21 +9884,21 @@
           <w:color w:val="5A5A5A"/>
           <w:sz w:val="18"/>
         </w:rPr>
-        <w:t>资料来源：项目设计与验证材料整理。</w:t>
+        <w:t>资料来源：作者根据项目设计、代码实现与验证结果整理。</w:t>
       </w:r>
     </w:p>
     <w:p>
       <w:pPr>
         <w:pStyle w:val="21"/>
       </w:pPr>
-      <w:bookmarkStart w:id="20" w:name="_Toc232608902"/>
+      <w:bookmarkStart w:id="24" w:name="_Toc232619465"/>
       <w:r>
         <w:t xml:space="preserve">5.3 </w:t>
       </w:r>
       <w:r>
         <w:t>典型问答验证</w:t>
       </w:r>
-      <w:bookmarkEnd w:id="20"/>
+      <w:bookmarkEnd w:id="24"/>
     </w:p>
     <w:p>
       <w:pPr>
@@ -8536,7 +9988,7 @@
           <w:noProof/>
         </w:rPr>
         <w:drawing>
-          <wp:inline distT="0" distB="0" distL="0" distR="0" wp14:anchorId="234E01C1" wp14:editId="02A61073">
+          <wp:inline distT="0" distB="0" distL="0" distR="0" wp14:anchorId="7A8A4E0E" wp14:editId="26E17822">
             <wp:extent cx="5328000" cy="2997000"/>
             <wp:effectExtent l="0" t="0" r="0" b="0"/>
             <wp:docPr id="7" name="Picture 7"/>
@@ -8641,14 +10093,14 @@
       <w:pPr>
         <w:pStyle w:val="21"/>
       </w:pPr>
-      <w:bookmarkStart w:id="21" w:name="_Toc232608903"/>
+      <w:bookmarkStart w:id="25" w:name="_Toc232619466"/>
       <w:r>
         <w:t xml:space="preserve">5.4 </w:t>
       </w:r>
       <w:r>
         <w:t>测试分析</w:t>
       </w:r>
-      <w:bookmarkEnd w:id="21"/>
+      <w:bookmarkEnd w:id="25"/>
     </w:p>
     <w:p>
       <w:pPr>
@@ -8677,69 +10129,87 @@
         <w:rPr>
           <w:rFonts w:ascii="Times New Roman" w:hAnsi="Times New Roman"/>
         </w:rPr>
-        <w:t>当前系统仍有可继续提升的空间。例如，</w:t>
-      </w:r>
-      <w:r>
-        <w:rPr>
-          <w:rFonts w:ascii="Times New Roman" w:hAnsi="Times New Roman"/>
-        </w:rPr>
-        <w:t xml:space="preserve">RAG </w:t>
-      </w:r>
-      <w:r>
-        <w:rPr>
-          <w:rFonts w:ascii="Times New Roman" w:hAnsi="Times New Roman"/>
-        </w:rPr>
-        <w:t>评测集可以进一步扩展并自动评分；</w:t>
-      </w:r>
-      <w:r>
-        <w:rPr>
-          <w:rFonts w:ascii="Times New Roman" w:hAnsi="Times New Roman"/>
-        </w:rPr>
-        <w:t xml:space="preserve">/chat </w:t>
-      </w:r>
-      <w:r>
-        <w:rPr>
-          <w:rFonts w:ascii="Times New Roman" w:hAnsi="Times New Roman"/>
-        </w:rPr>
-        <w:t>可以增加流式输出改善交互体验；知识库可增加版本号、文档来源和权限字段；管理接口可进一步细化鉴权；运维工具可接入真实</w:t>
-      </w:r>
-      <w:r>
-        <w:rPr>
-          <w:rFonts w:ascii="Times New Roman" w:hAnsi="Times New Roman"/>
-        </w:rPr>
-        <w:t xml:space="preserve"> Prometheus</w:t>
-      </w:r>
-      <w:r>
-        <w:rPr>
-          <w:rFonts w:ascii="Times New Roman" w:hAnsi="Times New Roman"/>
-        </w:rPr>
-        <w:t>、日志平台和工单系统。</w:t>
+        <w:t>从召回结果看，支付订单相关问题能够稳定命中</w:t>
+      </w:r>
+      <w:r>
+        <w:rPr>
+          <w:rFonts w:ascii="Times New Roman" w:hAnsi="Times New Roman"/>
+        </w:rPr>
+        <w:t xml:space="preserve"> payment_order_runbook.md</w:t>
+      </w:r>
+      <w:r>
+        <w:rPr>
+          <w:rFonts w:ascii="Times New Roman" w:hAnsi="Times New Roman"/>
+        </w:rPr>
+        <w:t>，说明示例知识库的主题划分和分片策略能够支撑典型业务问题。从前端表现看，引用来源卡片能够展示命中文件和片段，使使用者可以在阅读答案后继续追溯原文。从部署结果看，公网首页、知识库文件列表和统一问答服务均可访问，说明系统不依赖本地浏览器或开发环境即可演示。</w:t>
       </w:r>
     </w:p>
     <w:p>
       <w:pPr>
-        <w:pStyle w:val="1"/>
-      </w:pPr>
-      <w:bookmarkStart w:id="22" w:name="_Toc232608904"/>
-      <w:r>
-        <w:t>第</w:t>
-      </w:r>
-      <w:r>
-        <w:t>6</w:t>
-      </w:r>
-      <w:r>
-        <w:t>章</w:t>
-      </w:r>
-      <w:r>
-        <w:t xml:space="preserve"> </w:t>
-      </w:r>
-      <w:r>
-        <w:t>总结</w:t>
-      </w:r>
-      <w:bookmarkEnd w:id="22"/>
+        <w:ind w:firstLine="482"/>
+        <w:jc w:val="both"/>
+        <w:rPr>
+          <w:rFonts w:hint="eastAsia"/>
+        </w:rPr>
+      </w:pPr>
+      <w:r>
+        <w:rPr>
+          <w:rFonts w:ascii="Times New Roman" w:hAnsi="Times New Roman"/>
+        </w:rPr>
+        <w:t>当前系统仍有可继续提升的空间。例如，</w:t>
+      </w:r>
+      <w:r>
+        <w:rPr>
+          <w:rFonts w:ascii="Times New Roman" w:hAnsi="Times New Roman"/>
+        </w:rPr>
+        <w:t xml:space="preserve">RAG </w:t>
+      </w:r>
+      <w:r>
+        <w:rPr>
+          <w:rFonts w:ascii="Times New Roman" w:hAnsi="Times New Roman"/>
+        </w:rPr>
+        <w:t>评测集可以进一步扩展并自动评分；</w:t>
+      </w:r>
+      <w:r>
+        <w:rPr>
+          <w:rFonts w:ascii="Times New Roman" w:hAnsi="Times New Roman"/>
+        </w:rPr>
+        <w:t xml:space="preserve">/chat </w:t>
+      </w:r>
+      <w:r>
+        <w:rPr>
+          <w:rFonts w:ascii="Times New Roman" w:hAnsi="Times New Roman"/>
+        </w:rPr>
+        <w:t>可以增加流式输出改善交互体验；知识库可增加版本号、文档来源和权限字段；管理接口可进一步细化鉴权；运维工具可接入真实</w:t>
+      </w:r>
+      <w:r>
+        <w:rPr>
+          <w:rFonts w:ascii="Times New Roman" w:hAnsi="Times New Roman"/>
+        </w:rPr>
+        <w:t xml:space="preserve"> Prometheus</w:t>
+      </w:r>
+      <w:r>
+        <w:rPr>
+          <w:rFonts w:ascii="Times New Roman" w:hAnsi="Times New Roman"/>
+        </w:rPr>
+        <w:t>、日志平台和工单系统。</w:t>
+      </w:r>
     </w:p>
     <w:p>
       <w:pPr>
+        <w:pStyle w:val="21"/>
+      </w:pPr>
+      <w:bookmarkStart w:id="26" w:name="_Toc232619467"/>
+      <w:r>
+        <w:t xml:space="preserve">5.5 </w:t>
+      </w:r>
+      <w:r>
+        <w:t>局限性分析</w:t>
+      </w:r>
+      <w:bookmarkEnd w:id="26"/>
+    </w:p>
+    <w:p>
+      <w:pPr>
         <w:ind w:firstLine="482"/>
         <w:jc w:val="both"/>
         <w:rPr>
@@ -8750,55 +10220,67 @@
         <w:rPr>
           <w:rFonts w:ascii="Times New Roman" w:hAnsi="Times New Roman"/>
         </w:rPr>
-        <w:t>本文完成了智能</w:t>
-      </w:r>
-      <w:r>
-        <w:rPr>
-          <w:rFonts w:ascii="Times New Roman" w:hAnsi="Times New Roman"/>
-        </w:rPr>
-        <w:t xml:space="preserve"> OnCall Agent </w:t>
-      </w:r>
-      <w:r>
-        <w:rPr>
-          <w:rFonts w:ascii="Times New Roman" w:hAnsi="Times New Roman"/>
-        </w:rPr>
-        <w:t>的设计、实现、部署和验证。系统面向客服、售后与运维场景，使用</w:t>
-      </w:r>
-      <w:r>
-        <w:rPr>
-          <w:rFonts w:ascii="Times New Roman" w:hAnsi="Times New Roman"/>
-        </w:rPr>
-        <w:t xml:space="preserve"> RAG </w:t>
-      </w:r>
-      <w:r>
-        <w:rPr>
-          <w:rFonts w:ascii="Times New Roman" w:hAnsi="Times New Roman"/>
-        </w:rPr>
-        <w:t>将业务资料转化为可检索知识库，使用</w:t>
-      </w:r>
-      <w:r>
-        <w:rPr>
-          <w:rFonts w:ascii="Times New Roman" w:hAnsi="Times New Roman"/>
-        </w:rPr>
-        <w:t xml:space="preserve"> ReAct </w:t>
-      </w:r>
-      <w:r>
-        <w:rPr>
-          <w:rFonts w:ascii="Times New Roman" w:hAnsi="Times New Roman"/>
-        </w:rPr>
-        <w:t>模式将知识库和工具组织为可扩展智能体，并通过标准</w:t>
-      </w:r>
-      <w:r>
-        <w:rPr>
-          <w:rFonts w:ascii="Times New Roman" w:hAnsi="Times New Roman"/>
-        </w:rPr>
-        <w:t xml:space="preserve"> /chat </w:t>
-      </w:r>
-      <w:r>
-        <w:rPr>
-          <w:rFonts w:ascii="Times New Roman" w:hAnsi="Times New Roman"/>
-        </w:rPr>
-        <w:t>接口、前端问答页面、引用来源展示和知识库管理页面形成完整应用。</w:t>
+        <w:t>由于当前知识库以示例资料为主，覆盖范围仍有限，当用户提出知识库之外的业务规则时，系统可能只能给出通用建议。为降低这种风险，一方面需要继续补充真实</w:t>
+      </w:r>
+      <w:r>
+        <w:rPr>
+          <w:rFonts w:ascii="Times New Roman" w:hAnsi="Times New Roman"/>
+        </w:rPr>
+        <w:t xml:space="preserve"> FAQ</w:t>
+      </w:r>
+      <w:r>
+        <w:rPr>
+          <w:rFonts w:ascii="Times New Roman" w:hAnsi="Times New Roman"/>
+        </w:rPr>
+        <w:t>、产品说明、故障手册和历史工单；另一方面需要在回答策略中要求模型区分</w:t>
+      </w:r>
+      <w:r>
+        <w:rPr>
+          <w:rFonts w:ascii="Times New Roman" w:hAnsi="Times New Roman"/>
+        </w:rPr>
+        <w:t>“</w:t>
+      </w:r>
+      <w:r>
+        <w:rPr>
+          <w:rFonts w:ascii="Times New Roman" w:hAnsi="Times New Roman"/>
+        </w:rPr>
+        <w:t>已从知识库确认的信息</w:t>
+      </w:r>
+      <w:r>
+        <w:rPr>
+          <w:rFonts w:ascii="Times New Roman" w:hAnsi="Times New Roman"/>
+        </w:rPr>
+        <w:t>”</w:t>
+      </w:r>
+      <w:r>
+        <w:rPr>
+          <w:rFonts w:ascii="Times New Roman" w:hAnsi="Times New Roman"/>
+        </w:rPr>
+        <w:t>和</w:t>
+      </w:r>
+      <w:r>
+        <w:rPr>
+          <w:rFonts w:ascii="Times New Roman" w:hAnsi="Times New Roman"/>
+        </w:rPr>
+        <w:t>“</w:t>
+      </w:r>
+      <w:r>
+        <w:rPr>
+          <w:rFonts w:ascii="Times New Roman" w:hAnsi="Times New Roman"/>
+        </w:rPr>
+        <w:t>需要人工补充确认的信息</w:t>
+      </w:r>
+      <w:r>
+        <w:rPr>
+          <w:rFonts w:ascii="Times New Roman" w:hAnsi="Times New Roman"/>
+        </w:rPr>
+        <w:t>”</w:t>
+      </w:r>
+      <w:r>
+        <w:rPr>
+          <w:rFonts w:ascii="Times New Roman" w:hAnsi="Times New Roman"/>
+        </w:rPr>
+        <w:t>。</w:t>
       </w:r>
     </w:p>
     <w:p>
@@ -8813,35 +10295,57 @@
         <w:rPr>
           <w:rFonts w:ascii="Times New Roman" w:hAnsi="Times New Roman"/>
         </w:rPr>
-        <w:t>从工程结果看，项目已具备本地运行、云端访问、真实模型调用、知识库投喂、</w:t>
-      </w:r>
-      <w:r>
-        <w:rPr>
-          <w:rFonts w:ascii="Times New Roman" w:hAnsi="Times New Roman"/>
-        </w:rPr>
-        <w:t xml:space="preserve">RAG </w:t>
-      </w:r>
-      <w:r>
-        <w:rPr>
-          <w:rFonts w:ascii="Times New Roman" w:hAnsi="Times New Roman"/>
-        </w:rPr>
-        <w:t>问答、引用来源展示、知识库管理和基础鉴权能力。相比静态问答系统，本作品更强调知识可追溯、资料可更新、接口可集成和场景可扩展，适合在比赛中展示</w:t>
-      </w:r>
-      <w:r>
-        <w:rPr>
-          <w:rFonts w:ascii="Times New Roman" w:hAnsi="Times New Roman"/>
-        </w:rPr>
-        <w:t xml:space="preserve"> AI </w:t>
-      </w:r>
-      <w:r>
-        <w:rPr>
-          <w:rFonts w:ascii="Times New Roman" w:hAnsi="Times New Roman"/>
-        </w:rPr>
-        <w:t>应用于真实业务支持和运维辅助的落地价值。</w:t>
+        <w:t>此外，当前版本主要验证了文本</w:t>
+      </w:r>
+      <w:r>
+        <w:rPr>
+          <w:rFonts w:ascii="Times New Roman" w:hAnsi="Times New Roman"/>
+        </w:rPr>
+        <w:t xml:space="preserve"> RAG</w:t>
+      </w:r>
+      <w:r>
+        <w:rPr>
+          <w:rFonts w:ascii="Times New Roman" w:hAnsi="Times New Roman"/>
+        </w:rPr>
+        <w:t>、图片字段接入和工具调用框架，尚未深度接入真实生产监控和日志平台。因此在运维自动化方面，系统更适合作为辅助诊断工具，而不是直接闭环处置工具。后续若接入真实</w:t>
+      </w:r>
+      <w:r>
+        <w:rPr>
+          <w:rFonts w:ascii="Times New Roman" w:hAnsi="Times New Roman"/>
+        </w:rPr>
+        <w:t xml:space="preserve"> Prometheus</w:t>
+      </w:r>
+      <w:r>
+        <w:rPr>
+          <w:rFonts w:ascii="Times New Roman" w:hAnsi="Times New Roman"/>
+        </w:rPr>
+        <w:t>、日志平台和工单系统，需要进一步完善权限控制、审计日志、操作确认和回滚策略。</w:t>
       </w:r>
     </w:p>
     <w:p>
       <w:pPr>
+        <w:pStyle w:val="1"/>
+      </w:pPr>
+      <w:bookmarkStart w:id="27" w:name="_Toc232619468"/>
+      <w:r>
+        <w:t>第</w:t>
+      </w:r>
+      <w:r>
+        <w:t>6</w:t>
+      </w:r>
+      <w:r>
+        <w:t>章</w:t>
+      </w:r>
+      <w:r>
+        <w:t xml:space="preserve"> </w:t>
+      </w:r>
+      <w:r>
+        <w:t>总结</w:t>
+      </w:r>
+      <w:bookmarkEnd w:id="27"/>
+    </w:p>
+    <w:p>
+      <w:pPr>
         <w:ind w:firstLine="482"/>
         <w:jc w:val="both"/>
         <w:rPr>
@@ -8852,21 +10356,101 @@
         <w:rPr>
           <w:rFonts w:ascii="Times New Roman" w:hAnsi="Times New Roman"/>
         </w:rPr>
-        <w:t>后续可围绕三条路线继续完善：其一，增强数据治理能力，为知识库增加版本、来源、标签和权限；其二，增强评测能力，使用测试集自动计算命中率、答案完整度和引用正确性；其三，增强自动化运维能力，接入真实日志、监控、告警和工单系统，在人工确认边界内逐步实现从建议到半自动处理的闭环。</w:t>
+        <w:t>本文完成了智能</w:t>
+      </w:r>
+      <w:r>
+        <w:rPr>
+          <w:rFonts w:ascii="Times New Roman" w:hAnsi="Times New Roman"/>
+        </w:rPr>
+        <w:t xml:space="preserve"> OnCall Agent </w:t>
+      </w:r>
+      <w:r>
+        <w:rPr>
+          <w:rFonts w:ascii="Times New Roman" w:hAnsi="Times New Roman"/>
+        </w:rPr>
+        <w:t>的设计、实现、部署和验证。系统面向客服、售后与运维场景，使用</w:t>
+      </w:r>
+      <w:r>
+        <w:rPr>
+          <w:rFonts w:ascii="Times New Roman" w:hAnsi="Times New Roman"/>
+        </w:rPr>
+        <w:t xml:space="preserve"> RAG </w:t>
+      </w:r>
+      <w:r>
+        <w:rPr>
+          <w:rFonts w:ascii="Times New Roman" w:hAnsi="Times New Roman"/>
+        </w:rPr>
+        <w:t>将业务资料转化为可检索知识库，使用</w:t>
+      </w:r>
+      <w:r>
+        <w:rPr>
+          <w:rFonts w:ascii="Times New Roman" w:hAnsi="Times New Roman"/>
+        </w:rPr>
+        <w:t xml:space="preserve"> ReAct </w:t>
+      </w:r>
+      <w:r>
+        <w:rPr>
+          <w:rFonts w:ascii="Times New Roman" w:hAnsi="Times New Roman"/>
+        </w:rPr>
+        <w:t>模式将知识库和工具组织为可扩展智能体，并通过标准</w:t>
+      </w:r>
+      <w:r>
+        <w:rPr>
+          <w:rFonts w:ascii="Times New Roman" w:hAnsi="Times New Roman"/>
+        </w:rPr>
+        <w:t xml:space="preserve"> /chat </w:t>
+      </w:r>
+      <w:r>
+        <w:rPr>
+          <w:rFonts w:ascii="Times New Roman" w:hAnsi="Times New Roman"/>
+        </w:rPr>
+        <w:t>接口、前端问答页面、引用来源展示和知识库管理页面形成完整应用。</w:t>
       </w:r>
     </w:p>
     <w:p>
       <w:pPr>
-        <w:pStyle w:val="1"/>
-      </w:pPr>
-      <w:bookmarkStart w:id="23" w:name="_Toc232608905"/>
-      <w:r>
-        <w:t>参考文献</w:t>
-      </w:r>
-      <w:bookmarkEnd w:id="23"/>
+        <w:ind w:firstLine="482"/>
+        <w:jc w:val="both"/>
+        <w:rPr>
+          <w:rFonts w:hint="eastAsia"/>
+        </w:rPr>
+      </w:pPr>
+      <w:r>
+        <w:rPr>
+          <w:rFonts w:ascii="Times New Roman" w:hAnsi="Times New Roman"/>
+        </w:rPr>
+        <w:lastRenderedPageBreak/>
+        <w:t>从工程结果看，项目已具备本地运行、云端访问、真实模型调用、知识库投喂、</w:t>
+      </w:r>
+      <w:r>
+        <w:rPr>
+          <w:rFonts w:ascii="Times New Roman" w:hAnsi="Times New Roman"/>
+        </w:rPr>
+        <w:t xml:space="preserve">RAG </w:t>
+      </w:r>
+      <w:r>
+        <w:rPr>
+          <w:rFonts w:ascii="Times New Roman" w:hAnsi="Times New Roman"/>
+        </w:rPr>
+        <w:t>问答、引用来源展示、知识库管理和基础鉴权能力。相比静态问答系统，本作品更强调知识可追溯、资料可更新、接口可集成和场景可扩展，适合作为</w:t>
+      </w:r>
+      <w:r>
+        <w:rPr>
+          <w:rFonts w:ascii="Times New Roman" w:hAnsi="Times New Roman"/>
+        </w:rPr>
+        <w:t xml:space="preserve"> AI </w:t>
+      </w:r>
+      <w:r>
+        <w:rPr>
+          <w:rFonts w:ascii="Times New Roman" w:hAnsi="Times New Roman"/>
+        </w:rPr>
+        <w:t>应用于真实业务支持和运维辅助的落地示例。</w:t>
+      </w:r>
     </w:p>
     <w:p>
       <w:pPr>
+        <w:ind w:firstLine="482"/>
+        <w:jc w:val="both"/>
         <w:rPr>
           <w:rFonts w:hint="eastAsia"/>
         </w:rPr>
@@ -8874,13 +10458,14 @@
       <w:r>
         <w:rPr>
           <w:rFonts w:ascii="Times New Roman" w:hAnsi="Times New Roman"/>
-          <w:sz w:val="21"/>
-        </w:rPr>
-        <w:t>[1] Lewis P., Perez E., Piktus A., et al. Retrieval-Augmented Generation for Knowledge-Intensive NLP Tasks. NeurIPS, 2020.</w:t>
+        </w:rPr>
+        <w:t>后续可围绕三条路线继续完善：其一，增强数据治理能力，为知识库增加版本、来源、标签和权限；其二，增强评测能力，使用测试集自动计算命中率、答案完整度和引用正确性；其三，增强自动化运维能力，接入真实日志、监控、告警和工单系统，在人工确认边界内逐步实现从建议到半自动处理的闭环。</w:t>
       </w:r>
     </w:p>
     <w:p>
       <w:pPr>
+        <w:ind w:firstLine="482"/>
+        <w:jc w:val="both"/>
         <w:rPr>
           <w:rFonts w:hint="eastAsia"/>
         </w:rPr>
@@ -8888,13 +10473,34 @@
       <w:r>
         <w:rPr>
           <w:rFonts w:ascii="Times New Roman" w:hAnsi="Times New Roman"/>
-          <w:sz w:val="21"/>
-        </w:rPr>
-        <w:t>[2] Yao S., Zhao J., Yu D., et al. ReAct: Synergizing Reasoning and Acting in Language Models. ICLR, 2023.</w:t>
+        </w:rPr>
+        <w:t>总体而言，本作品验证了一条具有现实可行性的技术路线：用</w:t>
+      </w:r>
+      <w:r>
+        <w:rPr>
+          <w:rFonts w:ascii="Times New Roman" w:hAnsi="Times New Roman"/>
+        </w:rPr>
+        <w:t xml:space="preserve"> RAG </w:t>
+      </w:r>
+      <w:r>
+        <w:rPr>
+          <w:rFonts w:ascii="Times New Roman" w:hAnsi="Times New Roman"/>
+        </w:rPr>
+        <w:t>承接企业内部知识，用智能体工具调用承接复杂任务过程，用工程化部署承接真实访问和演示需求。它不依赖一次性训练大型专用模型，也不把大模型回答作为不可解释的最终结论，而是通过知识来源、工具结果和人机协同边界共同提高系统可信度。</w:t>
       </w:r>
     </w:p>
     <w:p>
       <w:pPr>
+        <w:pStyle w:val="1"/>
+      </w:pPr>
+      <w:bookmarkStart w:id="28" w:name="_Toc232619469"/>
+      <w:r>
+        <w:t>参考文献</w:t>
+      </w:r>
+      <w:bookmarkEnd w:id="28"/>
+    </w:p>
+    <w:p>
+      <w:pPr>
         <w:rPr>
           <w:rFonts w:hint="eastAsia"/>
         </w:rPr>
@@ -8904,7 +10510,34 @@
           <w:rFonts w:ascii="Times New Roman" w:hAnsi="Times New Roman"/>
           <w:sz w:val="21"/>
         </w:rPr>
-        <w:lastRenderedPageBreak/>
+        <w:t>[1] Lewis P., Perez E., Piktus A., et al. Retrieval-Augmented Generation for Knowledge-Intensive NLP Tasks. NeurIPS, 2020.</w:t>
+      </w:r>
+    </w:p>
+    <w:p>
+      <w:pPr>
+        <w:rPr>
+          <w:rFonts w:hint="eastAsia"/>
+        </w:rPr>
+      </w:pPr>
+      <w:r>
+        <w:rPr>
+          <w:rFonts w:ascii="Times New Roman" w:hAnsi="Times New Roman"/>
+          <w:sz w:val="21"/>
+        </w:rPr>
+        <w:t>[2] Yao S., Zhao J., Yu D., et al. ReAct: Synergizing Reasoning and Acting in Language Models. ICLR, 2023.</w:t>
+      </w:r>
+    </w:p>
+    <w:p>
+      <w:pPr>
+        <w:rPr>
+          <w:rFonts w:hint="eastAsia"/>
+        </w:rPr>
+      </w:pPr>
+      <w:r>
+        <w:rPr>
+          <w:rFonts w:ascii="Times New Roman" w:hAnsi="Times New Roman"/>
+          <w:sz w:val="21"/>
+        </w:rPr>
         <w:t>[3] Milvus Documentation. Vector Database and Similarity Search Documentation. https://milvus.io/docs</w:t>
       </w:r>
     </w:p>
@@ -9325,31 +10958,31 @@
       </w:rPr>
     </w:lvl>
   </w:abstractNum>
-  <w:num w:numId="1" w16cid:durableId="1819148776">
+  <w:num w:numId="1" w16cid:durableId="986663952">
     <w:abstractNumId w:val="8"/>
   </w:num>
-  <w:num w:numId="2" w16cid:durableId="1241448532">
+  <w:num w:numId="2" w16cid:durableId="760759376">
     <w:abstractNumId w:val="6"/>
   </w:num>
-  <w:num w:numId="3" w16cid:durableId="1212113210">
+  <w:num w:numId="3" w16cid:durableId="528683258">
     <w:abstractNumId w:val="5"/>
   </w:num>
-  <w:num w:numId="4" w16cid:durableId="1192456208">
+  <w:num w:numId="4" w16cid:durableId="2042509405">
     <w:abstractNumId w:val="4"/>
   </w:num>
-  <w:num w:numId="5" w16cid:durableId="996037527">
+  <w:num w:numId="5" w16cid:durableId="1368217395">
     <w:abstractNumId w:val="7"/>
   </w:num>
-  <w:num w:numId="6" w16cid:durableId="782312786">
+  <w:num w:numId="6" w16cid:durableId="1669627608">
     <w:abstractNumId w:val="3"/>
   </w:num>
-  <w:num w:numId="7" w16cid:durableId="732434689">
+  <w:num w:numId="7" w16cid:durableId="1785227986">
     <w:abstractNumId w:val="2"/>
   </w:num>
-  <w:num w:numId="8" w16cid:durableId="2080202170">
+  <w:num w:numId="8" w16cid:durableId="364254382">
     <w:abstractNumId w:val="1"/>
   </w:num>
-  <w:num w:numId="9" w16cid:durableId="1129010908">
+  <w:num w:numId="9" w16cid:durableId="774642288">
     <w:abstractNumId w:val="0"/>
   </w:num>
 </w:numbering>
@@ -20749,7 +22382,7 @@
     <w:autoRedefine/>
     <w:uiPriority w:val="39"/>
     <w:unhideWhenUsed/>
-    <w:rsid w:val="0005004A"/>
+    <w:rsid w:val="00CC6852"/>
   </w:style>
   <w:style w:type="paragraph" w:styleId="TOC2">
     <w:name w:val="toc 2"/>
@@ -20758,7 +22391,7 @@
     <w:autoRedefine/>
     <w:uiPriority w:val="39"/>
     <w:unhideWhenUsed/>
-    <w:rsid w:val="0005004A"/>
+    <w:rsid w:val="00CC6852"/>
     <w:pPr>
       <w:ind w:leftChars="200" w:left="420"/>
     </w:pPr>
@@ -20768,7 +22401,7 @@
     <w:basedOn w:val="a2"/>
     <w:uiPriority w:val="99"/>
     <w:unhideWhenUsed/>
-    <w:rsid w:val="0005004A"/>
+    <w:rsid w:val="00CC6852"/>
     <w:rPr>
       <w:color w:val="0000FF" w:themeColor="hyperlink"/>
       <w:u w:val="single"/>

</xml_diff>